<commit_message>
Working through threat analysis document
</commit_message>
<xml_diff>
--- a/Attack Surface Analysis - Web Crawler.docx
+++ b/Attack Surface Analysis - Web Crawler.docx
@@ -8,15 +8,7 @@
       </w:pPr>
       <w:bookmarkStart w:id="0" w:name="Xa9367c27ffb917d65f556dfe04d91716f189298"/>
       <w:r>
-        <w:t xml:space="preserve">Attack Surface Analysis Example — </w:t>
-      </w:r>
-      <w:proofErr w:type="spellStart"/>
-      <w:r>
-        <w:t>WebHarvester</w:t>
-      </w:r>
-      <w:proofErr w:type="spellEnd"/>
-      <w:r>
-        <w:t xml:space="preserve"> (Web Crawler Project)</w:t>
+        <w:t>Attack Surface Analysis Example — WebHarvester (Web Crawler Project)</w:t>
       </w:r>
     </w:p>
     <w:p>
@@ -46,11 +38,9 @@
       <w:r>
         <w:t xml:space="preserve"> </w:t>
       </w:r>
-      <w:proofErr w:type="spellStart"/>
       <w:r>
         <w:t>PageHarvester</w:t>
       </w:r>
-      <w:proofErr w:type="spellEnd"/>
       <w:r>
         <w:tab/>
       </w:r>
@@ -140,7 +130,7 @@
     <w:p>
       <w:r>
         <w:pict w14:anchorId="158BCC27">
-          <v:rect id="_x0000_i1025" style="width:0;height:1.5pt" o:hralign="center" o:hrstd="t" o:hr="t"/>
+          <v:rect id="_x0000_i1095" style="width:0;height:1.5pt" o:hralign="center" o:hrstd="t" o:hr="t"/>
         </w:pict>
       </w:r>
     </w:p>
@@ -158,13 +148,8 @@
       <w:pPr>
         <w:pStyle w:val="FirstParagraph"/>
       </w:pPr>
-      <w:proofErr w:type="spellStart"/>
-      <w:r>
-        <w:t>PageHarvester</w:t>
-      </w:r>
-      <w:proofErr w:type="spellEnd"/>
-      <w:r>
-        <w:t xml:space="preserve"> is a program which</w:t>
+      <w:r>
+        <w:t>PageHarvester is a program which</w:t>
       </w:r>
       <w:r>
         <w:t xml:space="preserve"> autonomously</w:t>
@@ -180,13 +165,8 @@
       <w:pPr>
         <w:pStyle w:val="BodyText"/>
       </w:pPr>
-      <w:proofErr w:type="spellStart"/>
-      <w:r>
-        <w:t>PageHarvester</w:t>
-      </w:r>
-      <w:proofErr w:type="spellEnd"/>
-      <w:r>
-        <w:t xml:space="preserve"> employs the following features:</w:t>
+      <w:r>
+        <w:t>PageHarvester employs the following features:</w:t>
       </w:r>
     </w:p>
     <w:p>
@@ -249,10 +229,16 @@
     <w:p>
       <w:r>
         <w:pict w14:anchorId="158BCC28">
-          <v:rect id="_x0000_i1026" style="width:0;height:1.5pt" o:hralign="center" o:hrstd="t" o:hr="t"/>
+          <v:rect id="_x0000_i1104" style="width:0;height:1.5pt" o:hralign="center" o:bullet="t" o:hrstd="t" o:hr="t"/>
         </w:pict>
       </w:r>
     </w:p>
+    <w:p>
+      <w:r>
+        <w:br w:type="page"/>
+      </w:r>
+    </w:p>
+    <w:p/>
     <w:p>
       <w:pPr>
         <w:pStyle w:val="Heading2"/>
@@ -285,6 +271,130 @@
     <w:p>
       <w:pPr>
         <w:pStyle w:val="Compact"/>
+        <w:ind w:left="720"/>
+      </w:pPr>
+      <w:r>
+        <w:t xml:space="preserve">The </w:t>
+      </w:r>
+      <w:r>
+        <w:t>software is comprised of two classes.</w:t>
+      </w:r>
+      <w:r>
+        <w:t xml:space="preserve"> Crawler and Logger</w:t>
+      </w:r>
+      <w:r>
+        <w:t>.</w:t>
+      </w:r>
+      <w:r>
+        <w:t xml:space="preserve"> Crawler handles most of the heavy lifting while the </w:t>
+      </w:r>
+      <w:r>
+        <w:t>logger class sends basic status updates to a log file.</w:t>
+      </w:r>
+    </w:p>
+    <w:p>
+      <w:pPr>
+        <w:pStyle w:val="Compact"/>
+        <w:ind w:left="720"/>
+      </w:pPr>
+    </w:p>
+    <w:p>
+      <w:pPr>
+        <w:pStyle w:val="Compact"/>
+        <w:ind w:left="720"/>
+        <w:jc w:val="center"/>
+      </w:pPr>
+      <w:r>
+        <w:drawing>
+          <wp:inline distT="0" distB="0" distL="0" distR="0" wp14:anchorId="701D39E3" wp14:editId="2C42BE8A">
+            <wp:extent cx="3892750" cy="2540131"/>
+            <wp:effectExtent l="0" t="0" r="0" b="0"/>
+            <wp:docPr id="423781941" name="Picture 1"/>
+            <wp:cNvGraphicFramePr>
+              <a:graphicFrameLocks xmlns:a="http://schemas.openxmlformats.org/drawingml/2006/main" noChangeAspect="1"/>
+            </wp:cNvGraphicFramePr>
+            <a:graphic xmlns:a="http://schemas.openxmlformats.org/drawingml/2006/main">
+              <a:graphicData uri="http://schemas.openxmlformats.org/drawingml/2006/picture">
+                <pic:pic xmlns:pic="http://schemas.openxmlformats.org/drawingml/2006/picture">
+                  <pic:nvPicPr>
+                    <pic:cNvPr id="423781941" name=""/>
+                    <pic:cNvPicPr/>
+                  </pic:nvPicPr>
+                  <pic:blipFill>
+                    <a:blip r:embed="rId5"/>
+                    <a:stretch>
+                      <a:fillRect/>
+                    </a:stretch>
+                  </pic:blipFill>
+                  <pic:spPr>
+                    <a:xfrm>
+                      <a:off x="0" y="0"/>
+                      <a:ext cx="3892750" cy="2540131"/>
+                    </a:xfrm>
+                    <a:prstGeom prst="rect">
+                      <a:avLst/>
+                    </a:prstGeom>
+                  </pic:spPr>
+                </pic:pic>
+              </a:graphicData>
+            </a:graphic>
+          </wp:inline>
+        </w:drawing>
+      </w:r>
+    </w:p>
+    <w:p>
+      <w:pPr>
+        <w:pStyle w:val="Compact"/>
+        <w:ind w:left="720"/>
+      </w:pPr>
+    </w:p>
+    <w:p>
+      <w:pPr>
+        <w:pStyle w:val="Compact"/>
+        <w:ind w:left="720"/>
+        <w:jc w:val="center"/>
+      </w:pPr>
+      <w:r>
+        <w:drawing>
+          <wp:inline distT="0" distB="0" distL="0" distR="0" wp14:anchorId="3C19FA5F" wp14:editId="4BA6D3F8">
+            <wp:extent cx="2749691" cy="1047804"/>
+            <wp:effectExtent l="0" t="0" r="0" b="0"/>
+            <wp:docPr id="1911513782" name="Picture 1"/>
+            <wp:cNvGraphicFramePr>
+              <a:graphicFrameLocks xmlns:a="http://schemas.openxmlformats.org/drawingml/2006/main" noChangeAspect="1"/>
+            </wp:cNvGraphicFramePr>
+            <a:graphic xmlns:a="http://schemas.openxmlformats.org/drawingml/2006/main">
+              <a:graphicData uri="http://schemas.openxmlformats.org/drawingml/2006/picture">
+                <pic:pic xmlns:pic="http://schemas.openxmlformats.org/drawingml/2006/picture">
+                  <pic:nvPicPr>
+                    <pic:cNvPr id="1911513782" name=""/>
+                    <pic:cNvPicPr/>
+                  </pic:nvPicPr>
+                  <pic:blipFill>
+                    <a:blip r:embed="rId6"/>
+                    <a:stretch>
+                      <a:fillRect/>
+                    </a:stretch>
+                  </pic:blipFill>
+                  <pic:spPr>
+                    <a:xfrm>
+                      <a:off x="0" y="0"/>
+                      <a:ext cx="2749691" cy="1047804"/>
+                    </a:xfrm>
+                    <a:prstGeom prst="rect">
+                      <a:avLst/>
+                    </a:prstGeom>
+                  </pic:spPr>
+                </pic:pic>
+              </a:graphicData>
+            </a:graphic>
+          </wp:inline>
+        </w:drawing>
+      </w:r>
+    </w:p>
+    <w:p>
+      <w:pPr>
+        <w:pStyle w:val="Compact"/>
       </w:pPr>
     </w:p>
     <w:p>
@@ -313,11 +423,15 @@
         <w:pStyle w:val="Compact"/>
         <w:numPr>
           <w:ilvl w:val="1"/>
-          <w:numId w:val="4"/>
+          <w:numId w:val="3"/>
         </w:numPr>
       </w:pPr>
       <w:r>
-        <w:t>Scheduler / Job Manager (RabbitMQ / Celery or custom)</w:t>
+        <w:rPr>
+          <w:b/>
+          <w:bCs/>
+        </w:rPr>
+        <w:t>Requests</w:t>
       </w:r>
     </w:p>
     <w:p>
@@ -325,11 +439,15 @@
         <w:pStyle w:val="Compact"/>
         <w:numPr>
           <w:ilvl w:val="1"/>
-          <w:numId w:val="4"/>
+          <w:numId w:val="3"/>
         </w:numPr>
       </w:pPr>
       <w:r>
-        <w:t>Fetcher workers (Scrapy or Requests + Async)</w:t>
+        <w:rPr>
+          <w:b/>
+          <w:bCs/>
+        </w:rPr>
+        <w:t>Pathlib</w:t>
       </w:r>
     </w:p>
     <w:p>
@@ -337,27 +455,15 @@
         <w:pStyle w:val="Compact"/>
         <w:numPr>
           <w:ilvl w:val="1"/>
-          <w:numId w:val="4"/>
+          <w:numId w:val="3"/>
         </w:numPr>
       </w:pPr>
       <w:r>
-        <w:t>Parser (</w:t>
-      </w:r>
-      <w:proofErr w:type="spellStart"/>
-      <w:r>
-        <w:t>BeautifulSoup</w:t>
-      </w:r>
-      <w:proofErr w:type="spellEnd"/>
-      <w:r>
-        <w:t xml:space="preserve"> / </w:t>
-      </w:r>
-      <w:proofErr w:type="spellStart"/>
-      <w:r>
-        <w:t>lxml</w:t>
-      </w:r>
-      <w:proofErr w:type="spellEnd"/>
-      <w:r>
-        <w:t xml:space="preserve"> / custom extractor)</w:t>
+        <w:rPr>
+          <w:b/>
+          <w:bCs/>
+        </w:rPr>
+        <w:t>Datetime</w:t>
       </w:r>
     </w:p>
     <w:p>
@@ -365,11 +471,15 @@
         <w:pStyle w:val="Compact"/>
         <w:numPr>
           <w:ilvl w:val="1"/>
-          <w:numId w:val="4"/>
+          <w:numId w:val="3"/>
         </w:numPr>
       </w:pPr>
       <w:r>
-        <w:t>Storage: Raw HTML store (S3 or filesystem) + Processed DB (PostgreSQL / Elasticsearch)</w:t>
+        <w:rPr>
+          <w:b/>
+          <w:bCs/>
+        </w:rPr>
+        <w:t>Time</w:t>
       </w:r>
     </w:p>
     <w:p>
@@ -377,11 +487,15 @@
         <w:pStyle w:val="Compact"/>
         <w:numPr>
           <w:ilvl w:val="1"/>
-          <w:numId w:val="4"/>
+          <w:numId w:val="3"/>
         </w:numPr>
       </w:pPr>
       <w:r>
-        <w:t>Analysis pipeline (Python scripts / ML models)</w:t>
+        <w:rPr>
+          <w:b/>
+          <w:bCs/>
+        </w:rPr>
+        <w:t>Re</w:t>
       </w:r>
     </w:p>
     <w:p>
@@ -389,11 +503,46 @@
         <w:pStyle w:val="Compact"/>
         <w:numPr>
           <w:ilvl w:val="1"/>
-          <w:numId w:val="4"/>
+          <w:numId w:val="3"/>
         </w:numPr>
       </w:pPr>
       <w:r>
-        <w:t>Admin UI / Dashboard (React)</w:t>
+        <w:rPr>
+          <w:b/>
+          <w:bCs/>
+        </w:rPr>
+        <w:t>Sys</w:t>
+      </w:r>
+    </w:p>
+    <w:p>
+      <w:pPr>
+        <w:pStyle w:val="Compact"/>
+        <w:numPr>
+          <w:ilvl w:val="1"/>
+          <w:numId w:val="3"/>
+        </w:numPr>
+      </w:pPr>
+      <w:r>
+        <w:rPr>
+          <w:b/>
+          <w:bCs/>
+        </w:rPr>
+        <w:t>Urllib.robotparser</w:t>
+      </w:r>
+    </w:p>
+    <w:p>
+      <w:pPr>
+        <w:rPr>
+          <w:b/>
+          <w:bCs/>
+        </w:rPr>
+      </w:pPr>
+      <w:r>
+        <w:rPr>
+          <w:b/>
+          <w:bCs/>
+        </w:rPr>
+        <w:br w:type="page"/>
       </w:r>
     </w:p>
     <w:p>
@@ -413,13 +562,76 @@
         <w:t>Data flows:</w:t>
       </w:r>
       <w:r>
-        <w:t xml:space="preserve"> seed URLs → scheduler assigns fetch tasks → fetcher downloads pages → parser extracts data → store raw + structured data → analysis jobs read structured data</w:t>
+        <w:t xml:space="preserve"> </w:t>
+      </w:r>
+    </w:p>
+    <w:p>
+      <w:pPr>
+        <w:pStyle w:val="Compact"/>
+        <w:numPr>
+          <w:ilvl w:val="1"/>
+          <w:numId w:val="3"/>
+        </w:numPr>
+      </w:pPr>
+      <w:r>
+        <w:t>Crawler class prompts user for a URL to crawl</w:t>
+      </w:r>
+      <w:r>
+        <w:t xml:space="preserve"> and a term to search for</w:t>
+      </w:r>
+      <w:r>
+        <w:t xml:space="preserve"> -&gt; </w:t>
+      </w:r>
+      <w:r>
+        <w:t>crawler.parse_robots.txt is called, if successful - &gt;</w:t>
+      </w:r>
+      <w:r>
+        <w:t xml:space="preserve"> crawler.store_sitemaps</w:t>
+      </w:r>
+      <w:r>
+        <w:t xml:space="preserve"> is called.</w:t>
+      </w:r>
+    </w:p>
+    <w:p>
+      <w:pPr>
+        <w:pStyle w:val="Compact"/>
+        <w:numPr>
+          <w:ilvl w:val="2"/>
+          <w:numId w:val="3"/>
+        </w:numPr>
+      </w:pPr>
+      <w:r>
+        <w:t xml:space="preserve">Store sitemaps saves </w:t>
+      </w:r>
+      <w:r>
+        <w:t>all xml files that are “allowable” and include the search term provided by the user.</w:t>
+      </w:r>
+      <w:r>
+        <w:t xml:space="preserve"> Crawler.outputFiles is incremented each time. </w:t>
+      </w:r>
+    </w:p>
+    <w:p>
+      <w:pPr>
+        <w:pStyle w:val="Compact"/>
+        <w:numPr>
+          <w:ilvl w:val="1"/>
+          <w:numId w:val="3"/>
+        </w:numPr>
+      </w:pPr>
+      <w:r>
+        <w:t xml:space="preserve">For each </w:t>
+      </w:r>
+      <w:r>
+        <w:t xml:space="preserve">count of crawler.outputFiles crawler.download_pages is run. Storing html content of allowable and </w:t>
+      </w:r>
+      <w:r>
+        <w:t>relevant pages.</w:t>
       </w:r>
     </w:p>
     <w:p>
       <w:r>
         <w:pict w14:anchorId="158BCC29">
-          <v:rect id="_x0000_i1027" style="width:0;height:1.5pt" o:hralign="center" o:hrstd="t" o:hr="t"/>
+          <v:rect id="_x0000_i1096" style="width:0;height:1.5pt" o:hralign="center" o:hrstd="t" o:hr="t"/>
         </w:pict>
       </w:r>
     </w:p>
@@ -790,7 +1002,7 @@
     <w:p>
       <w:r>
         <w:pict w14:anchorId="158BCC2A">
-          <v:rect id="_x0000_i1028" style="width:0;height:1.5pt" o:hralign="center" o:hrstd="t" o:hr="t"/>
+          <v:rect id="_x0000_i1097" style="width:0;height:1.5pt" o:hralign="center" o:hrstd="t" o:hr="t"/>
         </w:pict>
       </w:r>
     </w:p>
@@ -991,13 +1203,8 @@
             <w:pPr>
               <w:pStyle w:val="Compact"/>
             </w:pPr>
-            <w:proofErr w:type="gramStart"/>
-            <w:r>
-              <w:t>Parser</w:t>
-            </w:r>
-            <w:proofErr w:type="gramEnd"/>
-            <w:r>
-              <w:t xml:space="preserve"> (local)</w:t>
+            <w:r>
+              <w:t>Parser (local)</w:t>
             </w:r>
           </w:p>
         </w:tc>
@@ -1131,33 +1338,47 @@
               <w:pStyle w:val="Compact"/>
             </w:pPr>
             <w:r>
-              <w:t>Scheduler / Jobs</w:t>
-            </w:r>
-          </w:p>
-        </w:tc>
-        <w:tc>
-          <w:tcPr>
-            <w:tcW w:w="1584" w:type="dxa"/>
-          </w:tcPr>
-          <w:p>
-            <w:pPr>
-              <w:pStyle w:val="Compact"/>
-            </w:pPr>
-            <w:r>
-              <w:t>HTTPS, authenticated API</w:t>
-            </w:r>
-          </w:p>
-        </w:tc>
-        <w:tc>
-          <w:tcPr>
-            <w:tcW w:w="1584" w:type="dxa"/>
-          </w:tcPr>
-          <w:p>
-            <w:pPr>
-              <w:pStyle w:val="Compact"/>
-            </w:pPr>
-            <w:r>
-              <w:t>Crawl configs, job control</w:t>
+              <w:t xml:space="preserve">Scheduler / </w:t>
+            </w:r>
+            <w:r>
+              <w:lastRenderedPageBreak/>
+              <w:t>Jobs</w:t>
+            </w:r>
+          </w:p>
+        </w:tc>
+        <w:tc>
+          <w:tcPr>
+            <w:tcW w:w="1584" w:type="dxa"/>
+          </w:tcPr>
+          <w:p>
+            <w:pPr>
+              <w:pStyle w:val="Compact"/>
+            </w:pPr>
+            <w:r>
+              <w:lastRenderedPageBreak/>
+              <w:t xml:space="preserve">HTTPS, </w:t>
+            </w:r>
+            <w:r>
+              <w:lastRenderedPageBreak/>
+              <w:t>authenticated API</w:t>
+            </w:r>
+          </w:p>
+        </w:tc>
+        <w:tc>
+          <w:tcPr>
+            <w:tcW w:w="1584" w:type="dxa"/>
+          </w:tcPr>
+          <w:p>
+            <w:pPr>
+              <w:pStyle w:val="Compact"/>
+            </w:pPr>
+            <w:r>
+              <w:lastRenderedPageBreak/>
+              <w:t xml:space="preserve">Crawl configs, </w:t>
+            </w:r>
+            <w:r>
+              <w:lastRenderedPageBreak/>
+              <w:t>job control</w:t>
             </w:r>
           </w:p>
         </w:tc>
@@ -1166,7 +1387,7 @@
     <w:p>
       <w:r>
         <w:pict w14:anchorId="158BCC2B">
-          <v:rect id="_x0000_i1029" style="width:0;height:1.5pt" o:hralign="center" o:hrstd="t" o:hr="t"/>
+          <v:rect id="_x0000_i1098" style="width:0;height:1.5pt" o:hralign="center" o:hrstd="t" o:hr="t"/>
         </w:pict>
       </w:r>
     </w:p>
@@ -1226,19 +1447,11 @@
       <w:r>
         <w:t xml:space="preserve">, API </w:t>
       </w:r>
-      <w:proofErr w:type="gramStart"/>
       <w:r>
         <w:rPr>
           <w:rStyle w:val="VerbatimChar"/>
         </w:rPr>
-        <w:t>api.webharvest</w:t>
-      </w:r>
-      <w:proofErr w:type="gramEnd"/>
-      <w:r>
-        <w:rPr>
-          <w:rStyle w:val="VerbatimChar"/>
-        </w:rPr>
-        <w:t>:443</w:t>
+        <w:t>api.webharvest:443</w:t>
       </w:r>
       <w:r>
         <w:t xml:space="preserve"> (internal), SSH for workers (internal only)</w:t>
@@ -1298,15 +1511,7 @@
         <w:t>Exposed services:</w:t>
       </w:r>
       <w:r>
-        <w:t xml:space="preserve"> Admin API (443), metrics endpoint (</w:t>
-      </w:r>
-      <w:proofErr w:type="spellStart"/>
-      <w:r>
-        <w:t>prometheus</w:t>
-      </w:r>
-      <w:proofErr w:type="spellEnd"/>
-      <w:r>
-        <w:t>) internal</w:t>
+        <w:t xml:space="preserve"> Admin API (443), metrics endpoint (prometheus) internal</w:t>
       </w:r>
     </w:p>
     <w:p>
@@ -1335,29 +1540,8 @@
         <w:t>Crawler code / frameworks:</w:t>
       </w:r>
       <w:r>
-        <w:t xml:space="preserve"> Scrapy / </w:t>
-      </w:r>
-      <w:proofErr w:type="spellStart"/>
-      <w:r>
-        <w:t>aiohttp</w:t>
-      </w:r>
-      <w:proofErr w:type="spellEnd"/>
-      <w:r>
-        <w:t xml:space="preserve"> / requests; Parsers using </w:t>
-      </w:r>
-      <w:proofErr w:type="spellStart"/>
-      <w:r>
-        <w:t>BeautifulSoup</w:t>
-      </w:r>
-      <w:proofErr w:type="spellEnd"/>
-      <w:r>
-        <w:t xml:space="preserve"> / </w:t>
-      </w:r>
-      <w:proofErr w:type="spellStart"/>
-      <w:r>
-        <w:t>lxml</w:t>
-      </w:r>
-      <w:proofErr w:type="spellEnd"/>
+        <w:t xml:space="preserve"> Scrapy / aiohttp / requests; Parsers using BeautifulSoup / lxml</w:t>
+      </w:r>
     </w:p>
     <w:p>
       <w:pPr>
@@ -1399,16 +1583,8 @@
         <w:rPr>
           <w:rStyle w:val="VerbatimChar"/>
         </w:rPr>
-        <w:t>GET /data</w:t>
-      </w:r>
-      <w:proofErr w:type="gramStart"/>
-      <w:r>
-        <w:rPr>
-          <w:rStyle w:val="VerbatimChar"/>
-        </w:rPr>
-        <w:t>/:job</w:t>
-      </w:r>
-      <w:proofErr w:type="gramEnd"/>
+        <w:t>GET /data/:job</w:t>
+      </w:r>
       <w:r>
         <w:t xml:space="preserve"> (auth required)</w:t>
       </w:r>
@@ -1625,6 +1801,7 @@
       <w:bookmarkStart w:id="11" w:name="X8d292ca11434dadaaec348cbe13fb80a8ccb421"/>
       <w:bookmarkEnd w:id="10"/>
       <w:r>
+        <w:lastRenderedPageBreak/>
         <w:t>E. External dependencies (libraries, APIs, frameworks)</w:t>
       </w:r>
     </w:p>
@@ -1644,37 +1821,8 @@
         <w:t>Libraries:</w:t>
       </w:r>
       <w:r>
-        <w:t xml:space="preserve"> Scrapy, Requests/</w:t>
-      </w:r>
-      <w:proofErr w:type="spellStart"/>
-      <w:r>
-        <w:t>Aiohttp</w:t>
-      </w:r>
-      <w:proofErr w:type="spellEnd"/>
-      <w:r>
-        <w:t xml:space="preserve">, </w:t>
-      </w:r>
-      <w:proofErr w:type="spellStart"/>
-      <w:r>
-        <w:t>BeautifulSoup</w:t>
-      </w:r>
-      <w:proofErr w:type="spellEnd"/>
-      <w:r>
-        <w:t xml:space="preserve">, </w:t>
-      </w:r>
-      <w:proofErr w:type="spellStart"/>
-      <w:r>
-        <w:t>lxml</w:t>
-      </w:r>
-      <w:proofErr w:type="spellEnd"/>
-      <w:r>
-        <w:t xml:space="preserve">, </w:t>
-      </w:r>
-      <w:proofErr w:type="spellStart"/>
-      <w:r>
-        <w:t>SQLAlchemy</w:t>
-      </w:r>
-      <w:proofErr w:type="spellEnd"/>
+        <w:t xml:space="preserve"> Scrapy, Requests/Aiohttp, BeautifulSoup, lxml, SQLAlchemy</w:t>
+      </w:r>
     </w:p>
     <w:p>
       <w:pPr>
@@ -1698,7 +1846,7 @@
     <w:p>
       <w:r>
         <w:pict w14:anchorId="158BCC2C">
-          <v:rect id="_x0000_i1030" style="width:0;height:1.5pt" o:hralign="center" o:hrstd="t" o:hr="t"/>
+          <v:rect id="_x0000_i1099" style="width:0;height:1.5pt" o:hralign="center" o:hrstd="t" o:hr="t"/>
         </w:pict>
       </w:r>
     </w:p>
@@ -1710,7 +1858,6 @@
       <w:bookmarkEnd w:id="6"/>
       <w:bookmarkEnd w:id="11"/>
       <w:r>
-        <w:lastRenderedPageBreak/>
         <w:t>7. Threats &amp; Attack Vectors (mapping)</w:t>
       </w:r>
     </w:p>
@@ -1910,13 +2057,8 @@
               <w:pStyle w:val="Compact"/>
             </w:pPr>
             <w:r>
-              <w:t xml:space="preserve">Crafted HTML triggering parser vulnerabilities or causing regex </w:t>
-            </w:r>
-            <w:proofErr w:type="spellStart"/>
-            <w:r>
-              <w:t>ReDoS</w:t>
-            </w:r>
-            <w:proofErr w:type="spellEnd"/>
+              <w:t>Crafted HTML triggering parser vulnerabilities or causing regex ReDoS</w:t>
+            </w:r>
           </w:p>
         </w:tc>
         <w:tc>
@@ -2122,15 +2264,7 @@
               <w:pStyle w:val="Compact"/>
             </w:pPr>
             <w:r>
-              <w:t xml:space="preserve">Vulnerable Python packages (e.g., </w:t>
-            </w:r>
-            <w:proofErr w:type="spellStart"/>
-            <w:r>
-              <w:t>lxml</w:t>
-            </w:r>
-            <w:proofErr w:type="spellEnd"/>
-            <w:r>
-              <w:t>)</w:t>
+              <w:t>Vulnerable Python packages (e.g., lxml)</w:t>
             </w:r>
           </w:p>
         </w:tc>
@@ -2239,7 +2373,7 @@
       <w:bookmarkEnd w:id="12"/>
       <w:r>
         <w:pict w14:anchorId="158BCC2E">
-          <v:rect id="_x0000_i1031" style="width:0;height:1.5pt" o:hralign="center" o:hrstd="t" o:hr="t"/>
+          <v:rect id="_x0000_i1100" style="width:0;height:1.5pt" o:hralign="center" o:hrstd="t" o:hr="t"/>
         </w:pict>
       </w:r>
     </w:p>
@@ -2250,6 +2384,7 @@
       <w:bookmarkStart w:id="14" w:name="attack-surface-summary-table"/>
       <w:bookmarkEnd w:id="13"/>
       <w:r>
+        <w:lastRenderedPageBreak/>
         <w:t>8. Attack Surface Summary Table</w:t>
       </w:r>
     </w:p>
@@ -2348,11 +2483,7 @@
               <w:pStyle w:val="Compact"/>
             </w:pPr>
             <w:r>
-              <w:t>Direct interaction with attacker-</w:t>
-            </w:r>
-            <w:r>
-              <w:lastRenderedPageBreak/>
-              <w:t>controlled servers</w:t>
+              <w:t>Direct interaction with attacker-controlled servers</w:t>
             </w:r>
           </w:p>
         </w:tc>
@@ -2366,7 +2497,6 @@
               <w:jc w:val="right"/>
             </w:pPr>
             <w:r>
-              <w:lastRenderedPageBreak/>
               <w:t>5</w:t>
             </w:r>
           </w:p>
@@ -2508,7 +2638,7 @@
     <w:p>
       <w:r>
         <w:pict w14:anchorId="158BCC2F">
-          <v:rect id="_x0000_i1032" style="width:0;height:1.5pt" o:hralign="center" o:hrstd="t" o:hr="t"/>
+          <v:rect id="_x0000_i1101" style="width:0;height:1.5pt" o:hralign="center" o:hrstd="t" o:hr="t"/>
         </w:pict>
       </w:r>
     </w:p>
@@ -2533,7 +2663,7 @@
     <w:p>
       <w:r>
         <w:pict w14:anchorId="158BCC34">
-          <v:rect id="_x0000_i1033" style="width:0;height:1.5pt" o:hralign="center" o:hrstd="t" o:hr="t"/>
+          <v:rect id="_x0000_i1102" style="width:0;height:1.5pt" o:hralign="center" o:hrstd="t" o:hr="t"/>
         </w:pict>
       </w:r>
     </w:p>
@@ -2556,21 +2686,13 @@
         </w:numPr>
       </w:pPr>
       <w:r>
-        <w:t xml:space="preserve">v1.0 — 2025-11-13 — Converted example to </w:t>
-      </w:r>
-      <w:proofErr w:type="spellStart"/>
-      <w:r>
-        <w:t>WebHarvester</w:t>
-      </w:r>
-      <w:proofErr w:type="spellEnd"/>
-      <w:r>
-        <w:t xml:space="preserve"> (crawler) project</w:t>
+        <w:t>v1.0 — 2025-11-13 — Converted example to WebHarvester (crawler) project</w:t>
       </w:r>
     </w:p>
     <w:p>
       <w:r>
         <w:pict w14:anchorId="158BCC35">
-          <v:rect id="_x0000_i1034" style="width:0;height:1.5pt" o:hralign="center" o:hrstd="t" o:hr="t"/>
+          <v:rect id="_x0000_i1103" style="width:0;height:1.5pt" o:hralign="center" o:hrstd="t" o:hr="t"/>
         </w:pict>
       </w:r>
     </w:p>
@@ -2641,6 +2763,11 @@
 
 <file path=word/numbering.xml><?xml version="1.0" encoding="utf-8"?>
 <w:numbering xmlns:wpc="http://schemas.microsoft.com/office/word/2010/wordprocessingCanvas" xmlns:cx="http://schemas.microsoft.com/office/drawing/2014/chartex" xmlns:cx1="http://schemas.microsoft.com/office/drawing/2015/9/8/chartex" xmlns:cx2="http://schemas.microsoft.com/office/drawing/2015/10/21/chartex" xmlns:cx3="http://schemas.microsoft.com/office/drawing/2016/5/9/chartex" xmlns:cx4="http://schemas.microsoft.com/office/drawing/2016/5/10/chartex" xmlns:cx5="http://schemas.microsoft.com/office/drawing/2016/5/11/chartex" xmlns:cx6="http://schemas.microsoft.com/office/drawing/2016/5/12/chartex" xmlns:cx7="http://schemas.microsoft.com/office/drawing/2016/5/13/chartex" xmlns:cx8="http://schemas.microsoft.com/office/drawing/2016/5/14/chartex" xmlns:mc="http://schemas.openxmlformats.org/markup-compatibility/2006" xmlns:aink="http://schemas.microsoft.com/office/drawing/2016/ink" xmlns:am3d="http://schemas.microsoft.com/office/drawing/2017/model3d" xmlns:o="urn:schemas-microsoft-com:office:office" xmlns:oel="http://schemas.microsoft.com/office/2019/extlst" xmlns:r="http://schemas.openxmlformats.org/officeDocument/2006/relationships" xmlns:m="http://schemas.openxmlformats.org/officeDocument/2006/math" xmlns:v="urn:schemas-microsoft-com:vml" xmlns:wp14="http://schemas.microsoft.com/office/word/2010/wordprocessingDrawing" xmlns:wp="http://schemas.openxmlformats.org/drawingml/2006/wordprocessingDrawing" xmlns:w10="urn:schemas-microsoft-com:office:word" xmlns:w="http://schemas.openxmlformats.org/wordprocessingml/2006/main" xmlns:w14="http://schemas.microsoft.com/office/word/2010/wordml" xmlns:w15="http://schemas.microsoft.com/office/word/2012/wordml" xmlns:w16cex="http://schemas.microsoft.com/office/word/2018/wordml/cex" xmlns:w16cid="http://schemas.microsoft.com/office/word/2016/wordml/cid" xmlns:w16="http://schemas.microsoft.com/office/word/2018/wordml" xmlns:w16du="http://schemas.microsoft.com/office/word/2023/wordml/word16du" xmlns:w16sdtdh="http://schemas.microsoft.com/office/word/2020/wordml/sdtdatahash" xmlns:w16sdtfl="http://schemas.microsoft.com/office/word/2024/wordml/sdtformatlock" xmlns:w16se="http://schemas.microsoft.com/office/word/2015/wordml/symex" xmlns:wpg="http://schemas.microsoft.com/office/word/2010/wordprocessingGroup" xmlns:wpi="http://schemas.microsoft.com/office/word/2010/wordprocessingInk" xmlns:wne="http://schemas.microsoft.com/office/word/2006/wordml" xmlns:wps="http://schemas.microsoft.com/office/word/2010/wordprocessingShape" mc:Ignorable="w14 w15 w16se w16cid w16 w16cex w16sdtdh w16sdtfl w16du wp14">
+  <w:numPicBullet w:numPicBulletId="0">
+    <w:pict>
+      <v:rect id="_x0000_i1025" style="width:0;height:1.5pt" o:hralign="center" o:bullet="t" o:hrstd="t" o:hr="t"/>
+    </w:pict>
+  </w:numPicBullet>
   <w:abstractNum w:abstractNumId="0" w15:restartNumberingAfterBreak="0">
     <w:nsid w:val="0000A990"/>
     <w:multiLevelType w:val="multilevel"/>

</xml_diff>

<commit_message>
draft of threat analysis document complete
</commit_message>
<xml_diff>
--- a/Attack Surface Analysis - Web Crawler.docx
+++ b/Attack Surface Analysis - Web Crawler.docx
@@ -130,7 +130,7 @@
     <w:p>
       <w:r>
         <w:pict w14:anchorId="158BCC27">
-          <v:rect id="_x0000_i1095" style="width:0;height:1.5pt" o:hralign="center" o:hrstd="t" o:hr="t"/>
+          <v:rect id="_x0000_i1166" style="width:0;height:1.5pt" o:hralign="center" o:hrstd="t" o:hr="t"/>
         </w:pict>
       </w:r>
     </w:p>
@@ -229,7 +229,7 @@
     <w:p>
       <w:r>
         <w:pict w14:anchorId="158BCC28">
-          <v:rect id="_x0000_i1104" style="width:0;height:1.5pt" o:hralign="center" o:bullet="t" o:hrstd="t" o:hr="t"/>
+          <v:rect id="_x0000_i1167" style="width:0;height:1.5pt" o:hralign="center" o:bullet="t" o:hrstd="t" o:hr="t"/>
         </w:pict>
       </w:r>
     </w:p>
@@ -305,6 +305,9 @@
         <w:jc w:val="center"/>
       </w:pPr>
       <w:r>
+        <w:rPr>
+          <w:noProof/>
+        </w:rPr>
         <w:drawing>
           <wp:inline distT="0" distB="0" distL="0" distR="0" wp14:anchorId="701D39E3" wp14:editId="2C42BE8A">
             <wp:extent cx="3892750" cy="2540131"/>
@@ -355,6 +358,9 @@
         <w:jc w:val="center"/>
       </w:pPr>
       <w:r>
+        <w:rPr>
+          <w:noProof/>
+        </w:rPr>
         <w:drawing>
           <wp:inline distT="0" distB="0" distL="0" distR="0" wp14:anchorId="3C19FA5F" wp14:editId="4BA6D3F8">
             <wp:extent cx="2749691" cy="1047804"/>
@@ -631,7 +637,7 @@
     <w:p>
       <w:r>
         <w:pict w14:anchorId="158BCC29">
-          <v:rect id="_x0000_i1096" style="width:0;height:1.5pt" o:hralign="center" o:hrstd="t" o:hr="t"/>
+          <v:rect id="_x0000_i1168" style="width:0;height:1.5pt" o:hralign="center" o:hrstd="t" o:hr="t"/>
         </w:pict>
       </w:r>
     </w:p>
@@ -666,7 +672,7 @@
         </w:trPr>
         <w:tc>
           <w:tcPr>
-            <w:tcW w:w="1584" w:type="dxa"/>
+            <w:tcW w:w="1916" w:type="dxa"/>
           </w:tcPr>
           <w:p>
             <w:pPr>
@@ -679,7 +685,7 @@
         </w:tc>
         <w:tc>
           <w:tcPr>
-            <w:tcW w:w="1584" w:type="dxa"/>
+            <w:tcW w:w="1915" w:type="dxa"/>
           </w:tcPr>
           <w:p>
             <w:pPr>
@@ -692,7 +698,7 @@
         </w:tc>
         <w:tc>
           <w:tcPr>
-            <w:tcW w:w="1584" w:type="dxa"/>
+            <w:tcW w:w="1915" w:type="dxa"/>
           </w:tcPr>
           <w:p>
             <w:pPr>
@@ -705,7 +711,7 @@
         </w:tc>
         <w:tc>
           <w:tcPr>
-            <w:tcW w:w="1584" w:type="dxa"/>
+            <w:tcW w:w="1915" w:type="dxa"/>
           </w:tcPr>
           <w:p>
             <w:pPr>
@@ -718,7 +724,7 @@
         </w:tc>
         <w:tc>
           <w:tcPr>
-            <w:tcW w:w="1584" w:type="dxa"/>
+            <w:tcW w:w="1915" w:type="dxa"/>
           </w:tcPr>
           <w:p>
             <w:pPr>
@@ -733,7 +739,7 @@
       <w:tr>
         <w:tc>
           <w:tcPr>
-            <w:tcW w:w="1584" w:type="dxa"/>
+            <w:tcW w:w="1916" w:type="dxa"/>
           </w:tcPr>
           <w:p>
             <w:pPr>
@@ -746,7 +752,7 @@
         </w:tc>
         <w:tc>
           <w:tcPr>
-            <w:tcW w:w="1584" w:type="dxa"/>
+            <w:tcW w:w="1915" w:type="dxa"/>
           </w:tcPr>
           <w:p>
             <w:pPr>
@@ -755,44 +761,56 @@
             <w:r>
               <w:t>Team</w:t>
             </w:r>
-          </w:p>
-        </w:tc>
-        <w:tc>
-          <w:tcPr>
-            <w:tcW w:w="1584" w:type="dxa"/>
-          </w:tcPr>
-          <w:p>
-            <w:pPr>
-              <w:pStyle w:val="Compact"/>
-            </w:pPr>
-            <w:r>
-              <w:t>Full downloaded pages (may contain PII)</w:t>
-            </w:r>
-          </w:p>
-        </w:tc>
-        <w:tc>
-          <w:tcPr>
-            <w:tcW w:w="1584" w:type="dxa"/>
-          </w:tcPr>
-          <w:p>
-            <w:pPr>
-              <w:pStyle w:val="Compact"/>
-            </w:pPr>
-            <w:r>
-              <w:t>Medium</w:t>
-            </w:r>
-          </w:p>
-        </w:tc>
-        <w:tc>
-          <w:tcPr>
-            <w:tcW w:w="1584" w:type="dxa"/>
-          </w:tcPr>
-          <w:p>
-            <w:pPr>
-              <w:pStyle w:val="Compact"/>
-            </w:pPr>
-            <w:r>
-              <w:t>Object storage (S3-like)</w:t>
+            <w:r>
+              <w:t>/End User</w:t>
+            </w:r>
+          </w:p>
+        </w:tc>
+        <w:tc>
+          <w:tcPr>
+            <w:tcW w:w="1915" w:type="dxa"/>
+          </w:tcPr>
+          <w:p>
+            <w:pPr>
+              <w:pStyle w:val="Compact"/>
+            </w:pPr>
+            <w:r>
+              <w:t xml:space="preserve">Full downloaded pages </w:t>
+            </w:r>
+          </w:p>
+        </w:tc>
+        <w:tc>
+          <w:tcPr>
+            <w:tcW w:w="1915" w:type="dxa"/>
+          </w:tcPr>
+          <w:p>
+            <w:pPr>
+              <w:pStyle w:val="Compact"/>
+            </w:pPr>
+            <w:r>
+              <w:t>Low</w:t>
+            </w:r>
+          </w:p>
+        </w:tc>
+        <w:tc>
+          <w:tcPr>
+            <w:tcW w:w="1915" w:type="dxa"/>
+          </w:tcPr>
+          <w:p>
+            <w:pPr>
+              <w:pStyle w:val="Compact"/>
+            </w:pPr>
+            <w:r>
+              <w:t>~/</w:t>
+            </w:r>
+            <w:r>
+              <w:t>_pages/”sentinel</w:t>
+            </w:r>
+            <w:r>
+              <w:t xml:space="preserve"> term”</w:t>
+            </w:r>
+            <w:r>
+              <w:t>/</w:t>
             </w:r>
           </w:p>
         </w:tc>
@@ -800,20 +818,20 @@
       <w:tr>
         <w:tc>
           <w:tcPr>
-            <w:tcW w:w="1584" w:type="dxa"/>
-          </w:tcPr>
-          <w:p>
-            <w:pPr>
-              <w:pStyle w:val="Compact"/>
-            </w:pPr>
-            <w:r>
-              <w:t>Extracted datasets</w:t>
-            </w:r>
-          </w:p>
-        </w:tc>
-        <w:tc>
-          <w:tcPr>
-            <w:tcW w:w="1584" w:type="dxa"/>
+            <w:tcW w:w="1916" w:type="dxa"/>
+          </w:tcPr>
+          <w:p>
+            <w:pPr>
+              <w:pStyle w:val="Compact"/>
+            </w:pPr>
+            <w:r>
+              <w:t>Stored XML Files</w:t>
+            </w:r>
+          </w:p>
+        </w:tc>
+        <w:tc>
+          <w:tcPr>
+            <w:tcW w:w="1915" w:type="dxa"/>
           </w:tcPr>
           <w:p>
             <w:pPr>
@@ -822,44 +840,65 @@
             <w:r>
               <w:t>Team</w:t>
             </w:r>
-          </w:p>
-        </w:tc>
-        <w:tc>
-          <w:tcPr>
-            <w:tcW w:w="1584" w:type="dxa"/>
-          </w:tcPr>
-          <w:p>
-            <w:pPr>
-              <w:pStyle w:val="Compact"/>
-            </w:pPr>
-            <w:r>
-              <w:t>Structured records for analysis</w:t>
-            </w:r>
-          </w:p>
-        </w:tc>
-        <w:tc>
-          <w:tcPr>
-            <w:tcW w:w="1584" w:type="dxa"/>
-          </w:tcPr>
-          <w:p>
-            <w:pPr>
-              <w:pStyle w:val="Compact"/>
-            </w:pPr>
-            <w:r>
-              <w:t>Medium</w:t>
-            </w:r>
-          </w:p>
-        </w:tc>
-        <w:tc>
-          <w:tcPr>
-            <w:tcW w:w="1584" w:type="dxa"/>
-          </w:tcPr>
-          <w:p>
-            <w:pPr>
-              <w:pStyle w:val="Compact"/>
-            </w:pPr>
-            <w:r>
-              <w:t>Database / Elasticsearch</w:t>
+            <w:r>
+              <w:t>/End User</w:t>
+            </w:r>
+          </w:p>
+        </w:tc>
+        <w:tc>
+          <w:tcPr>
+            <w:tcW w:w="1915" w:type="dxa"/>
+          </w:tcPr>
+          <w:p>
+            <w:pPr>
+              <w:pStyle w:val="Compact"/>
+            </w:pPr>
+            <w:r>
+              <w:t>S</w:t>
+            </w:r>
+            <w:r>
+              <w:t>itemaps containing allowed URLs</w:t>
+            </w:r>
+          </w:p>
+        </w:tc>
+        <w:tc>
+          <w:tcPr>
+            <w:tcW w:w="1915" w:type="dxa"/>
+          </w:tcPr>
+          <w:p>
+            <w:pPr>
+              <w:pStyle w:val="Compact"/>
+            </w:pPr>
+            <w:r>
+              <w:t>low</w:t>
+            </w:r>
+          </w:p>
+        </w:tc>
+        <w:tc>
+          <w:tcPr>
+            <w:tcW w:w="1915" w:type="dxa"/>
+          </w:tcPr>
+          <w:p>
+            <w:pPr>
+              <w:pStyle w:val="Compact"/>
+            </w:pPr>
+            <w:r>
+              <w:t>~/</w:t>
+            </w:r>
+            <w:r>
+              <w:t>_pages</w:t>
+            </w:r>
+            <w:r>
+              <w:t>/”sentinel term”</w:t>
+            </w:r>
+            <w:r>
+              <w:t xml:space="preserve"> or </w:t>
+            </w:r>
+            <w:r>
+              <w:t>~/</w:t>
+            </w:r>
+            <w:r>
+              <w:t>allowedSitemaps</w:t>
             </w:r>
           </w:p>
         </w:tc>
@@ -867,113 +906,52 @@
       <w:tr>
         <w:tc>
           <w:tcPr>
-            <w:tcW w:w="1584" w:type="dxa"/>
-          </w:tcPr>
-          <w:p>
-            <w:pPr>
-              <w:pStyle w:val="Compact"/>
-            </w:pPr>
-            <w:r>
-              <w:t>Crawl configuration &amp; seeds</w:t>
-            </w:r>
-          </w:p>
-        </w:tc>
-        <w:tc>
-          <w:tcPr>
-            <w:tcW w:w="1584" w:type="dxa"/>
-          </w:tcPr>
-          <w:p>
-            <w:pPr>
-              <w:pStyle w:val="Compact"/>
-            </w:pPr>
-            <w:r>
-              <w:t>Dev Ops</w:t>
-            </w:r>
-          </w:p>
-        </w:tc>
-        <w:tc>
-          <w:tcPr>
-            <w:tcW w:w="1584" w:type="dxa"/>
-          </w:tcPr>
-          <w:p>
-            <w:pPr>
-              <w:pStyle w:val="Compact"/>
-            </w:pPr>
-            <w:r>
-              <w:t>Target lists, rate limits, auth tokens</w:t>
-            </w:r>
-          </w:p>
-        </w:tc>
-        <w:tc>
-          <w:tcPr>
-            <w:tcW w:w="1584" w:type="dxa"/>
-          </w:tcPr>
-          <w:p>
-            <w:pPr>
-              <w:pStyle w:val="Compact"/>
-            </w:pPr>
-            <w:r>
-              <w:t>High</w:t>
-            </w:r>
-          </w:p>
-        </w:tc>
-        <w:tc>
-          <w:tcPr>
-            <w:tcW w:w="1584" w:type="dxa"/>
-          </w:tcPr>
-          <w:p>
-            <w:pPr>
-              <w:pStyle w:val="Compact"/>
-            </w:pPr>
-            <w:r>
-              <w:t>Vault / CI secrets</w:t>
-            </w:r>
-          </w:p>
-        </w:tc>
-      </w:tr>
-      <w:tr>
-        <w:tc>
-          <w:tcPr>
-            <w:tcW w:w="1584" w:type="dxa"/>
-          </w:tcPr>
-          <w:p>
-            <w:pPr>
-              <w:pStyle w:val="Compact"/>
-            </w:pPr>
-            <w:r>
-              <w:t>Logs &amp; metrics</w:t>
-            </w:r>
-          </w:p>
-        </w:tc>
-        <w:tc>
-          <w:tcPr>
-            <w:tcW w:w="1584" w:type="dxa"/>
-          </w:tcPr>
-          <w:p>
-            <w:pPr>
-              <w:pStyle w:val="Compact"/>
-            </w:pPr>
-            <w:r>
-              <w:t>Ops</w:t>
-            </w:r>
-          </w:p>
-        </w:tc>
-        <w:tc>
-          <w:tcPr>
-            <w:tcW w:w="1584" w:type="dxa"/>
-          </w:tcPr>
-          <w:p>
-            <w:pPr>
-              <w:pStyle w:val="Compact"/>
-            </w:pPr>
-            <w:r>
-              <w:t>Request logs, errors, performance</w:t>
-            </w:r>
-          </w:p>
-        </w:tc>
-        <w:tc>
-          <w:tcPr>
-            <w:tcW w:w="1584" w:type="dxa"/>
+            <w:tcW w:w="1916" w:type="dxa"/>
+          </w:tcPr>
+          <w:p>
+            <w:pPr>
+              <w:pStyle w:val="Compact"/>
+            </w:pPr>
+            <w:r>
+              <w:t>Log</w:t>
+            </w:r>
+            <w:r>
+              <w:t xml:space="preserve"> file</w:t>
+            </w:r>
+          </w:p>
+        </w:tc>
+        <w:tc>
+          <w:tcPr>
+            <w:tcW w:w="1915" w:type="dxa"/>
+          </w:tcPr>
+          <w:p>
+            <w:pPr>
+              <w:pStyle w:val="Compact"/>
+            </w:pPr>
+            <w:r>
+              <w:t>Team/End User</w:t>
+            </w:r>
+          </w:p>
+        </w:tc>
+        <w:tc>
+          <w:tcPr>
+            <w:tcW w:w="1915" w:type="dxa"/>
+          </w:tcPr>
+          <w:p>
+            <w:pPr>
+              <w:pStyle w:val="Compact"/>
+            </w:pPr>
+            <w:r>
+              <w:t xml:space="preserve">Log file of </w:t>
+            </w:r>
+            <w:r>
+              <w:t>operations</w:t>
+            </w:r>
+          </w:p>
+        </w:tc>
+        <w:tc>
+          <w:tcPr>
+            <w:tcW w:w="1915" w:type="dxa"/>
           </w:tcPr>
           <w:p>
             <w:pPr>
@@ -986,14 +964,14 @@
         </w:tc>
         <w:tc>
           <w:tcPr>
-            <w:tcW w:w="1584" w:type="dxa"/>
-          </w:tcPr>
-          <w:p>
-            <w:pPr>
-              <w:pStyle w:val="Compact"/>
-            </w:pPr>
-            <w:r>
-              <w:t>Logging service</w:t>
+            <w:tcW w:w="1915" w:type="dxa"/>
+          </w:tcPr>
+          <w:p>
+            <w:pPr>
+              <w:pStyle w:val="Compact"/>
+            </w:pPr>
+            <w:r>
+              <w:t>~</w:t>
             </w:r>
           </w:p>
         </w:tc>
@@ -1002,7 +980,7 @@
     <w:p>
       <w:r>
         <w:pict w14:anchorId="158BCC2A">
-          <v:rect id="_x0000_i1097" style="width:0;height:1.5pt" o:hralign="center" o:hrstd="t" o:hr="t"/>
+          <v:rect id="_x0000_i1169" style="width:0;height:1.5pt" o:hralign="center" o:hrstd="t" o:hr="t"/>
         </w:pict>
       </w:r>
     </w:p>
@@ -1037,7 +1015,10 @@
         </w:trPr>
         <w:tc>
           <w:tcPr>
-            <w:tcW w:w="1584" w:type="dxa"/>
+            <w:tcW w:w="1916" w:type="dxa"/>
+            <w:tcBorders>
+              <w:bottom w:val="single" w:sz="4" w:space="0" w:color="auto"/>
+            </w:tcBorders>
           </w:tcPr>
           <w:p>
             <w:pPr>
@@ -1050,33 +1031,42 @@
         </w:tc>
         <w:tc>
           <w:tcPr>
-            <w:tcW w:w="1584" w:type="dxa"/>
-          </w:tcPr>
-          <w:p>
-            <w:pPr>
-              <w:pStyle w:val="Compact"/>
-            </w:pPr>
-            <w:r>
-              <w:t>From (trust level)</w:t>
-            </w:r>
-          </w:p>
-        </w:tc>
-        <w:tc>
-          <w:tcPr>
-            <w:tcW w:w="1584" w:type="dxa"/>
-          </w:tcPr>
-          <w:p>
-            <w:pPr>
-              <w:pStyle w:val="Compact"/>
-            </w:pPr>
-            <w:r>
-              <w:t>To (trust level)</w:t>
-            </w:r>
-          </w:p>
-        </w:tc>
-        <w:tc>
-          <w:tcPr>
-            <w:tcW w:w="1584" w:type="dxa"/>
+            <w:tcW w:w="1915" w:type="dxa"/>
+            <w:tcBorders>
+              <w:bottom w:val="single" w:sz="4" w:space="0" w:color="auto"/>
+            </w:tcBorders>
+          </w:tcPr>
+          <w:p>
+            <w:pPr>
+              <w:pStyle w:val="Compact"/>
+            </w:pPr>
+            <w:r>
+              <w:t xml:space="preserve">From </w:t>
+            </w:r>
+          </w:p>
+        </w:tc>
+        <w:tc>
+          <w:tcPr>
+            <w:tcW w:w="1915" w:type="dxa"/>
+            <w:tcBorders>
+              <w:bottom w:val="single" w:sz="4" w:space="0" w:color="auto"/>
+            </w:tcBorders>
+          </w:tcPr>
+          <w:p>
+            <w:pPr>
+              <w:pStyle w:val="Compact"/>
+            </w:pPr>
+            <w:r>
+              <w:t xml:space="preserve">To </w:t>
+            </w:r>
+          </w:p>
+        </w:tc>
+        <w:tc>
+          <w:tcPr>
+            <w:tcW w:w="1915" w:type="dxa"/>
+            <w:tcBorders>
+              <w:bottom w:val="single" w:sz="4" w:space="0" w:color="auto"/>
+            </w:tcBorders>
           </w:tcPr>
           <w:p>
             <w:pPr>
@@ -1089,7 +1079,10 @@
         </w:tc>
         <w:tc>
           <w:tcPr>
-            <w:tcW w:w="1584" w:type="dxa"/>
+            <w:tcW w:w="1915" w:type="dxa"/>
+            <w:tcBorders>
+              <w:bottom w:val="single" w:sz="4" w:space="0" w:color="auto"/>
+            </w:tcBorders>
           </w:tcPr>
           <w:p>
             <w:pPr>
@@ -1104,7 +1097,13 @@
       <w:tr>
         <w:tc>
           <w:tcPr>
-            <w:tcW w:w="1584" w:type="dxa"/>
+            <w:tcW w:w="1916" w:type="dxa"/>
+            <w:tcBorders>
+              <w:top w:val="single" w:sz="4" w:space="0" w:color="auto"/>
+              <w:left w:val="single" w:sz="4" w:space="0" w:color="auto"/>
+              <w:bottom w:val="single" w:sz="4" w:space="0" w:color="auto"/>
+              <w:right w:val="single" w:sz="4" w:space="0" w:color="auto"/>
+            </w:tcBorders>
           </w:tcPr>
           <w:p>
             <w:pPr>
@@ -1117,53 +1116,83 @@
         </w:tc>
         <w:tc>
           <w:tcPr>
-            <w:tcW w:w="1584" w:type="dxa"/>
-          </w:tcPr>
-          <w:p>
-            <w:pPr>
-              <w:pStyle w:val="Compact"/>
-            </w:pPr>
-            <w:r>
-              <w:t>Public Internet</w:t>
-            </w:r>
-          </w:p>
-        </w:tc>
-        <w:tc>
-          <w:tcPr>
-            <w:tcW w:w="1584" w:type="dxa"/>
-          </w:tcPr>
-          <w:p>
-            <w:pPr>
-              <w:pStyle w:val="Compact"/>
-            </w:pPr>
-            <w:r>
-              <w:t>Fetcher workers</w:t>
-            </w:r>
-          </w:p>
-        </w:tc>
-        <w:tc>
-          <w:tcPr>
-            <w:tcW w:w="1584" w:type="dxa"/>
-          </w:tcPr>
-          <w:p>
-            <w:pPr>
-              <w:pStyle w:val="Compact"/>
-            </w:pPr>
-            <w:r>
-              <w:t>HTTP(S) requests</w:t>
-            </w:r>
-          </w:p>
-        </w:tc>
-        <w:tc>
-          <w:tcPr>
-            <w:tcW w:w="1584" w:type="dxa"/>
-          </w:tcPr>
-          <w:p>
-            <w:pPr>
-              <w:pStyle w:val="Compact"/>
-            </w:pPr>
-            <w:r>
-              <w:t>Remote web pages (raw HTML)</w:t>
+            <w:tcW w:w="1915" w:type="dxa"/>
+            <w:tcBorders>
+              <w:top w:val="single" w:sz="4" w:space="0" w:color="auto"/>
+              <w:left w:val="single" w:sz="4" w:space="0" w:color="auto"/>
+              <w:bottom w:val="single" w:sz="4" w:space="0" w:color="auto"/>
+              <w:right w:val="single" w:sz="4" w:space="0" w:color="auto"/>
+            </w:tcBorders>
+          </w:tcPr>
+          <w:p>
+            <w:pPr>
+              <w:pStyle w:val="Compact"/>
+            </w:pPr>
+            <w:r>
+              <w:t>User</w:t>
+            </w:r>
+          </w:p>
+        </w:tc>
+        <w:tc>
+          <w:tcPr>
+            <w:tcW w:w="1915" w:type="dxa"/>
+            <w:tcBorders>
+              <w:top w:val="single" w:sz="4" w:space="0" w:color="auto"/>
+              <w:left w:val="single" w:sz="4" w:space="0" w:color="auto"/>
+              <w:bottom w:val="single" w:sz="4" w:space="0" w:color="auto"/>
+              <w:right w:val="single" w:sz="4" w:space="0" w:color="auto"/>
+            </w:tcBorders>
+          </w:tcPr>
+          <w:p>
+            <w:pPr>
+              <w:pStyle w:val="Compact"/>
+            </w:pPr>
+            <w:r>
+              <w:t>Input handler</w:t>
+            </w:r>
+          </w:p>
+        </w:tc>
+        <w:tc>
+          <w:tcPr>
+            <w:tcW w:w="1915" w:type="dxa"/>
+            <w:tcBorders>
+              <w:top w:val="single" w:sz="4" w:space="0" w:color="auto"/>
+              <w:left w:val="single" w:sz="4" w:space="0" w:color="auto"/>
+              <w:bottom w:val="single" w:sz="4" w:space="0" w:color="auto"/>
+              <w:right w:val="single" w:sz="4" w:space="0" w:color="auto"/>
+            </w:tcBorders>
+          </w:tcPr>
+          <w:p>
+            <w:pPr>
+              <w:pStyle w:val="Compact"/>
+            </w:pPr>
+            <w:r>
+              <w:t>Python</w:t>
+            </w:r>
+            <w:r>
+              <w:t xml:space="preserve"> input stream handling</w:t>
+            </w:r>
+          </w:p>
+        </w:tc>
+        <w:tc>
+          <w:tcPr>
+            <w:tcW w:w="1915" w:type="dxa"/>
+            <w:tcBorders>
+              <w:top w:val="single" w:sz="4" w:space="0" w:color="auto"/>
+              <w:left w:val="single" w:sz="4" w:space="0" w:color="auto"/>
+              <w:bottom w:val="single" w:sz="4" w:space="0" w:color="auto"/>
+              <w:right w:val="single" w:sz="4" w:space="0" w:color="auto"/>
+            </w:tcBorders>
+          </w:tcPr>
+          <w:p>
+            <w:pPr>
+              <w:pStyle w:val="Compact"/>
+            </w:pPr>
+            <w:r>
+              <w:t>Input stream</w:t>
+            </w:r>
+            <w:r>
+              <w:t>, remaining processing.</w:t>
             </w:r>
           </w:p>
         </w:tc>
@@ -1171,66 +1200,105 @@
       <w:tr>
         <w:tc>
           <w:tcPr>
-            <w:tcW w:w="1584" w:type="dxa"/>
-          </w:tcPr>
-          <w:p>
-            <w:pPr>
-              <w:pStyle w:val="Compact"/>
-            </w:pPr>
-            <w:r>
-              <w:t>B2</w:t>
-            </w:r>
-          </w:p>
-        </w:tc>
-        <w:tc>
-          <w:tcPr>
-            <w:tcW w:w="1584" w:type="dxa"/>
-          </w:tcPr>
-          <w:p>
-            <w:pPr>
-              <w:pStyle w:val="Compact"/>
-            </w:pPr>
-            <w:r>
-              <w:t>Fetcher workers</w:t>
-            </w:r>
-          </w:p>
-        </w:tc>
-        <w:tc>
-          <w:tcPr>
-            <w:tcW w:w="1584" w:type="dxa"/>
-          </w:tcPr>
-          <w:p>
-            <w:pPr>
-              <w:pStyle w:val="Compact"/>
-            </w:pPr>
-            <w:r>
-              <w:t>Parser (local)</w:t>
-            </w:r>
-          </w:p>
-        </w:tc>
-        <w:tc>
-          <w:tcPr>
-            <w:tcW w:w="1584" w:type="dxa"/>
-          </w:tcPr>
-          <w:p>
-            <w:pPr>
-              <w:pStyle w:val="Compact"/>
-            </w:pPr>
-            <w:r>
-              <w:t>Local IPC / files</w:t>
-            </w:r>
-          </w:p>
-        </w:tc>
-        <w:tc>
-          <w:tcPr>
-            <w:tcW w:w="1584" w:type="dxa"/>
-          </w:tcPr>
-          <w:p>
-            <w:pPr>
-              <w:pStyle w:val="Compact"/>
-            </w:pPr>
-            <w:r>
-              <w:t>Raw HTML files</w:t>
+            <w:tcW w:w="1916" w:type="dxa"/>
+            <w:tcBorders>
+              <w:top w:val="single" w:sz="4" w:space="0" w:color="auto"/>
+              <w:left w:val="single" w:sz="4" w:space="0" w:color="auto"/>
+              <w:bottom w:val="single" w:sz="4" w:space="0" w:color="auto"/>
+              <w:right w:val="single" w:sz="4" w:space="0" w:color="auto"/>
+            </w:tcBorders>
+          </w:tcPr>
+          <w:p>
+            <w:pPr>
+              <w:pStyle w:val="Compact"/>
+              <w:tabs>
+                <w:tab w:val="left" w:pos="1350"/>
+              </w:tabs>
+            </w:pPr>
+            <w:r>
+              <w:t>B</w:t>
+            </w:r>
+            <w:r>
+              <w:t>2</w:t>
+            </w:r>
+          </w:p>
+        </w:tc>
+        <w:tc>
+          <w:tcPr>
+            <w:tcW w:w="1915" w:type="dxa"/>
+            <w:tcBorders>
+              <w:top w:val="single" w:sz="4" w:space="0" w:color="auto"/>
+              <w:left w:val="single" w:sz="4" w:space="0" w:color="auto"/>
+              <w:bottom w:val="single" w:sz="4" w:space="0" w:color="auto"/>
+              <w:right w:val="single" w:sz="4" w:space="0" w:color="auto"/>
+            </w:tcBorders>
+          </w:tcPr>
+          <w:p>
+            <w:pPr>
+              <w:pStyle w:val="Compact"/>
+            </w:pPr>
+            <w:r>
+              <w:t>Internet</w:t>
+            </w:r>
+          </w:p>
+        </w:tc>
+        <w:tc>
+          <w:tcPr>
+            <w:tcW w:w="1915" w:type="dxa"/>
+            <w:tcBorders>
+              <w:top w:val="single" w:sz="4" w:space="0" w:color="auto"/>
+              <w:left w:val="single" w:sz="4" w:space="0" w:color="auto"/>
+              <w:bottom w:val="single" w:sz="4" w:space="0" w:color="auto"/>
+              <w:right w:val="single" w:sz="4" w:space="0" w:color="auto"/>
+            </w:tcBorders>
+          </w:tcPr>
+          <w:p>
+            <w:pPr>
+              <w:pStyle w:val="Compact"/>
+            </w:pPr>
+            <w:r>
+              <w:t>End User’s Machine</w:t>
+            </w:r>
+          </w:p>
+        </w:tc>
+        <w:tc>
+          <w:tcPr>
+            <w:tcW w:w="1915" w:type="dxa"/>
+            <w:tcBorders>
+              <w:top w:val="single" w:sz="4" w:space="0" w:color="auto"/>
+              <w:left w:val="single" w:sz="4" w:space="0" w:color="auto"/>
+              <w:bottom w:val="single" w:sz="4" w:space="0" w:color="auto"/>
+              <w:right w:val="single" w:sz="4" w:space="0" w:color="auto"/>
+            </w:tcBorders>
+          </w:tcPr>
+          <w:p>
+            <w:pPr>
+              <w:pStyle w:val="Compact"/>
+            </w:pPr>
+            <w:r>
+              <w:t>HTTP Requests</w:t>
+            </w:r>
+          </w:p>
+        </w:tc>
+        <w:tc>
+          <w:tcPr>
+            <w:tcW w:w="1915" w:type="dxa"/>
+            <w:tcBorders>
+              <w:top w:val="single" w:sz="4" w:space="0" w:color="auto"/>
+              <w:left w:val="single" w:sz="4" w:space="0" w:color="auto"/>
+              <w:bottom w:val="single" w:sz="4" w:space="0" w:color="auto"/>
+              <w:right w:val="single" w:sz="4" w:space="0" w:color="auto"/>
+            </w:tcBorders>
+          </w:tcPr>
+          <w:p>
+            <w:pPr>
+              <w:pStyle w:val="Compact"/>
+            </w:pPr>
+            <w:r>
+              <w:t>Raw HTML Files, IP address, log file</w:t>
+            </w:r>
+            <w:r>
+              <w:t>.</w:t>
             </w:r>
           </w:p>
         </w:tc>
@@ -1238,66 +1306,99 @@
       <w:tr>
         <w:tc>
           <w:tcPr>
-            <w:tcW w:w="1584" w:type="dxa"/>
-          </w:tcPr>
-          <w:p>
-            <w:pPr>
-              <w:pStyle w:val="Compact"/>
-            </w:pPr>
-            <w:r>
-              <w:t>B3</w:t>
-            </w:r>
-          </w:p>
-        </w:tc>
-        <w:tc>
-          <w:tcPr>
-            <w:tcW w:w="1584" w:type="dxa"/>
-          </w:tcPr>
-          <w:p>
-            <w:pPr>
-              <w:pStyle w:val="Compact"/>
-            </w:pPr>
-            <w:r>
-              <w:t>Parser</w:t>
-            </w:r>
-          </w:p>
-        </w:tc>
-        <w:tc>
-          <w:tcPr>
-            <w:tcW w:w="1584" w:type="dxa"/>
-          </w:tcPr>
-          <w:p>
-            <w:pPr>
-              <w:pStyle w:val="Compact"/>
-            </w:pPr>
-            <w:r>
-              <w:t>Database/Storage</w:t>
-            </w:r>
-          </w:p>
-        </w:tc>
-        <w:tc>
-          <w:tcPr>
-            <w:tcW w:w="1584" w:type="dxa"/>
-          </w:tcPr>
-          <w:p>
-            <w:pPr>
-              <w:pStyle w:val="Compact"/>
-            </w:pPr>
-            <w:r>
-              <w:t>DB connection / API</w:t>
-            </w:r>
-          </w:p>
-        </w:tc>
-        <w:tc>
-          <w:tcPr>
-            <w:tcW w:w="1584" w:type="dxa"/>
-          </w:tcPr>
-          <w:p>
-            <w:pPr>
-              <w:pStyle w:val="Compact"/>
-            </w:pPr>
-            <w:r>
-              <w:t>Processed records, raw pages</w:t>
+            <w:tcW w:w="1916" w:type="dxa"/>
+            <w:tcBorders>
+              <w:top w:val="single" w:sz="4" w:space="0" w:color="auto"/>
+              <w:left w:val="single" w:sz="4" w:space="0" w:color="auto"/>
+              <w:bottom w:val="single" w:sz="4" w:space="0" w:color="auto"/>
+              <w:right w:val="single" w:sz="4" w:space="0" w:color="auto"/>
+            </w:tcBorders>
+          </w:tcPr>
+          <w:p>
+            <w:pPr>
+              <w:pStyle w:val="Compact"/>
+            </w:pPr>
+            <w:r>
+              <w:t>B</w:t>
+            </w:r>
+            <w:r>
+              <w:t>3</w:t>
+            </w:r>
+          </w:p>
+        </w:tc>
+        <w:tc>
+          <w:tcPr>
+            <w:tcW w:w="1915" w:type="dxa"/>
+            <w:tcBorders>
+              <w:top w:val="single" w:sz="4" w:space="0" w:color="auto"/>
+              <w:left w:val="single" w:sz="4" w:space="0" w:color="auto"/>
+              <w:bottom w:val="single" w:sz="4" w:space="0" w:color="auto"/>
+              <w:right w:val="single" w:sz="4" w:space="0" w:color="auto"/>
+            </w:tcBorders>
+          </w:tcPr>
+          <w:p>
+            <w:pPr>
+              <w:pStyle w:val="Compact"/>
+            </w:pPr>
+            <w:r>
+              <w:t>Robots.txt</w:t>
+            </w:r>
+          </w:p>
+        </w:tc>
+        <w:tc>
+          <w:tcPr>
+            <w:tcW w:w="1915" w:type="dxa"/>
+            <w:tcBorders>
+              <w:top w:val="single" w:sz="4" w:space="0" w:color="auto"/>
+              <w:left w:val="single" w:sz="4" w:space="0" w:color="auto"/>
+              <w:bottom w:val="single" w:sz="4" w:space="0" w:color="auto"/>
+              <w:right w:val="single" w:sz="4" w:space="0" w:color="auto"/>
+            </w:tcBorders>
+          </w:tcPr>
+          <w:p>
+            <w:pPr>
+              <w:pStyle w:val="Compact"/>
+            </w:pPr>
+            <w:r>
+              <w:t>Allowable URLs</w:t>
+            </w:r>
+          </w:p>
+        </w:tc>
+        <w:tc>
+          <w:tcPr>
+            <w:tcW w:w="1915" w:type="dxa"/>
+            <w:tcBorders>
+              <w:top w:val="single" w:sz="4" w:space="0" w:color="auto"/>
+              <w:left w:val="single" w:sz="4" w:space="0" w:color="auto"/>
+              <w:bottom w:val="single" w:sz="4" w:space="0" w:color="auto"/>
+              <w:right w:val="single" w:sz="4" w:space="0" w:color="auto"/>
+            </w:tcBorders>
+          </w:tcPr>
+          <w:p>
+            <w:pPr>
+              <w:pStyle w:val="Compact"/>
+            </w:pPr>
+            <w:r>
+              <w:t>RobotFileParser</w:t>
+            </w:r>
+          </w:p>
+        </w:tc>
+        <w:tc>
+          <w:tcPr>
+            <w:tcW w:w="1915" w:type="dxa"/>
+            <w:tcBorders>
+              <w:top w:val="single" w:sz="4" w:space="0" w:color="auto"/>
+              <w:left w:val="single" w:sz="4" w:space="0" w:color="auto"/>
+              <w:bottom w:val="single" w:sz="4" w:space="0" w:color="auto"/>
+              <w:right w:val="single" w:sz="4" w:space="0" w:color="auto"/>
+            </w:tcBorders>
+          </w:tcPr>
+          <w:p>
+            <w:pPr>
+              <w:pStyle w:val="Compact"/>
+            </w:pPr>
+            <w:r>
+              <w:t>Robots.txt, log file.</w:t>
             </w:r>
           </w:p>
         </w:tc>
@@ -1305,80 +1406,99 @@
       <w:tr>
         <w:tc>
           <w:tcPr>
-            <w:tcW w:w="1584" w:type="dxa"/>
-          </w:tcPr>
-          <w:p>
-            <w:pPr>
-              <w:pStyle w:val="Compact"/>
-            </w:pPr>
-            <w:r>
-              <w:t>B4</w:t>
-            </w:r>
-          </w:p>
-        </w:tc>
-        <w:tc>
-          <w:tcPr>
-            <w:tcW w:w="1584" w:type="dxa"/>
-          </w:tcPr>
-          <w:p>
-            <w:pPr>
-              <w:pStyle w:val="Compact"/>
-            </w:pPr>
-            <w:r>
-              <w:t>Admin UI</w:t>
-            </w:r>
-          </w:p>
-        </w:tc>
-        <w:tc>
-          <w:tcPr>
-            <w:tcW w:w="1584" w:type="dxa"/>
-          </w:tcPr>
-          <w:p>
-            <w:pPr>
-              <w:pStyle w:val="Compact"/>
-            </w:pPr>
-            <w:r>
-              <w:t xml:space="preserve">Scheduler / </w:t>
-            </w:r>
-            <w:r>
-              <w:lastRenderedPageBreak/>
-              <w:t>Jobs</w:t>
-            </w:r>
-          </w:p>
-        </w:tc>
-        <w:tc>
-          <w:tcPr>
-            <w:tcW w:w="1584" w:type="dxa"/>
-          </w:tcPr>
-          <w:p>
-            <w:pPr>
-              <w:pStyle w:val="Compact"/>
-            </w:pPr>
-            <w:r>
-              <w:lastRenderedPageBreak/>
-              <w:t xml:space="preserve">HTTPS, </w:t>
-            </w:r>
-            <w:r>
-              <w:lastRenderedPageBreak/>
-              <w:t>authenticated API</w:t>
-            </w:r>
-          </w:p>
-        </w:tc>
-        <w:tc>
-          <w:tcPr>
-            <w:tcW w:w="1584" w:type="dxa"/>
-          </w:tcPr>
-          <w:p>
-            <w:pPr>
-              <w:pStyle w:val="Compact"/>
-            </w:pPr>
-            <w:r>
-              <w:lastRenderedPageBreak/>
-              <w:t xml:space="preserve">Crawl configs, </w:t>
-            </w:r>
-            <w:r>
-              <w:lastRenderedPageBreak/>
-              <w:t>job control</w:t>
+            <w:tcW w:w="1916" w:type="dxa"/>
+            <w:tcBorders>
+              <w:top w:val="single" w:sz="4" w:space="0" w:color="auto"/>
+              <w:left w:val="single" w:sz="4" w:space="0" w:color="auto"/>
+              <w:bottom w:val="single" w:sz="4" w:space="0" w:color="auto"/>
+              <w:right w:val="single" w:sz="4" w:space="0" w:color="auto"/>
+            </w:tcBorders>
+          </w:tcPr>
+          <w:p>
+            <w:pPr>
+              <w:pStyle w:val="Compact"/>
+            </w:pPr>
+            <w:r>
+              <w:t>B</w:t>
+            </w:r>
+            <w:r>
+              <w:t>4</w:t>
+            </w:r>
+          </w:p>
+        </w:tc>
+        <w:tc>
+          <w:tcPr>
+            <w:tcW w:w="1915" w:type="dxa"/>
+            <w:tcBorders>
+              <w:top w:val="single" w:sz="4" w:space="0" w:color="auto"/>
+              <w:left w:val="single" w:sz="4" w:space="0" w:color="auto"/>
+              <w:bottom w:val="single" w:sz="4" w:space="0" w:color="auto"/>
+              <w:right w:val="single" w:sz="4" w:space="0" w:color="auto"/>
+            </w:tcBorders>
+          </w:tcPr>
+          <w:p>
+            <w:pPr>
+              <w:pStyle w:val="Compact"/>
+            </w:pPr>
+            <w:r>
+              <w:t>Allowed URL list</w:t>
+            </w:r>
+          </w:p>
+        </w:tc>
+        <w:tc>
+          <w:tcPr>
+            <w:tcW w:w="1915" w:type="dxa"/>
+            <w:tcBorders>
+              <w:top w:val="single" w:sz="4" w:space="0" w:color="auto"/>
+              <w:left w:val="single" w:sz="4" w:space="0" w:color="auto"/>
+              <w:bottom w:val="single" w:sz="4" w:space="0" w:color="auto"/>
+              <w:right w:val="single" w:sz="4" w:space="0" w:color="auto"/>
+            </w:tcBorders>
+          </w:tcPr>
+          <w:p>
+            <w:pPr>
+              <w:pStyle w:val="Compact"/>
+            </w:pPr>
+            <w:r>
+              <w:t>DownloadPages</w:t>
+            </w:r>
+          </w:p>
+        </w:tc>
+        <w:tc>
+          <w:tcPr>
+            <w:tcW w:w="1915" w:type="dxa"/>
+            <w:tcBorders>
+              <w:top w:val="single" w:sz="4" w:space="0" w:color="auto"/>
+              <w:left w:val="single" w:sz="4" w:space="0" w:color="auto"/>
+              <w:bottom w:val="single" w:sz="4" w:space="0" w:color="auto"/>
+              <w:right w:val="single" w:sz="4" w:space="0" w:color="auto"/>
+            </w:tcBorders>
+          </w:tcPr>
+          <w:p>
+            <w:pPr>
+              <w:pStyle w:val="Compact"/>
+            </w:pPr>
+            <w:r>
+              <w:t>Internal source code.</w:t>
+            </w:r>
+          </w:p>
+        </w:tc>
+        <w:tc>
+          <w:tcPr>
+            <w:tcW w:w="1915" w:type="dxa"/>
+            <w:tcBorders>
+              <w:top w:val="single" w:sz="4" w:space="0" w:color="auto"/>
+              <w:left w:val="single" w:sz="4" w:space="0" w:color="auto"/>
+              <w:bottom w:val="single" w:sz="4" w:space="0" w:color="auto"/>
+              <w:right w:val="single" w:sz="4" w:space="0" w:color="auto"/>
+            </w:tcBorders>
+          </w:tcPr>
+          <w:p>
+            <w:pPr>
+              <w:pStyle w:val="Compact"/>
+            </w:pPr>
+            <w:r>
+              <w:t>Filesystem, log file.</w:t>
             </w:r>
           </w:p>
         </w:tc>
@@ -1387,7 +1507,7 @@
     <w:p>
       <w:r>
         <w:pict w14:anchorId="158BCC2B">
-          <v:rect id="_x0000_i1098" style="width:0;height:1.5pt" o:hralign="center" o:hrstd="t" o:hr="t"/>
+          <v:rect id="_x0000_i1170" style="width:0;height:1.5pt" o:hralign="center" o:hrstd="t" o:hr="t"/>
         </w:pict>
       </w:r>
     </w:p>
@@ -1436,25 +1556,19 @@
         <w:t>External endpoints / ports:</w:t>
       </w:r>
       <w:r>
-        <w:t xml:space="preserve"> Admin UI </w:t>
-      </w:r>
-      <w:r>
-        <w:rPr>
-          <w:rStyle w:val="VerbatimChar"/>
-        </w:rPr>
-        <w:t>webharvest.edu:443</w:t>
-      </w:r>
-      <w:r>
-        <w:t xml:space="preserve">, API </w:t>
-      </w:r>
-      <w:r>
-        <w:rPr>
-          <w:rStyle w:val="VerbatimChar"/>
-        </w:rPr>
-        <w:t>api.webharvest:443</w:t>
-      </w:r>
-      <w:r>
-        <w:t xml:space="preserve"> (internal), SSH for workers (internal only)</w:t>
+        <w:t xml:space="preserve"> </w:t>
+      </w:r>
+      <w:r>
+        <w:t>HTTP &amp; HTTPS Requests</w:t>
+      </w:r>
+      <w:r>
+        <w:t xml:space="preserve"> port</w:t>
+      </w:r>
+      <w:r>
+        <w:t>s 80 and 443</w:t>
+      </w:r>
+      <w:r>
+        <w:t>.</w:t>
       </w:r>
     </w:p>
     <w:p>
@@ -1473,7 +1587,22 @@
         <w:t>Outbound network:</w:t>
       </w:r>
       <w:r>
-        <w:t xml:space="preserve"> Workers make outbound HTTP(S) connections to thousands of third-party sites (untrusted hosts)</w:t>
+        <w:t xml:space="preserve"> </w:t>
+      </w:r>
+      <w:r>
+        <w:t xml:space="preserve">Software makes outbound </w:t>
+      </w:r>
+      <w:r>
+        <w:t>requests</w:t>
+      </w:r>
+      <w:r>
+        <w:t xml:space="preserve"> to </w:t>
+      </w:r>
+      <w:r>
+        <w:t>servers</w:t>
+      </w:r>
+      <w:r>
+        <w:t xml:space="preserve"> of users choosing.</w:t>
       </w:r>
     </w:p>
     <w:p>
@@ -1492,7 +1621,7 @@
         <w:t>Protocols used:</w:t>
       </w:r>
       <w:r>
-        <w:t xml:space="preserve"> HTTP(S), SSH, AMQP (RabbitMQ), DB protocols (Postgres)</w:t>
+        <w:t xml:space="preserve"> HTTP(S)</w:t>
       </w:r>
     </w:p>
     <w:p>
@@ -1511,7 +1640,13 @@
         <w:t>Exposed services:</w:t>
       </w:r>
       <w:r>
-        <w:t xml:space="preserve"> Admin API (443), metrics endpoint (prometheus) internal</w:t>
+        <w:t xml:space="preserve"> </w:t>
+      </w:r>
+      <w:r>
+        <w:t>OS,</w:t>
+      </w:r>
+      <w:r>
+        <w:t xml:space="preserve"> networking drivers, ports</w:t>
       </w:r>
     </w:p>
     <w:p>
@@ -1540,7 +1675,10 @@
         <w:t>Crawler code / frameworks:</w:t>
       </w:r>
       <w:r>
-        <w:t xml:space="preserve"> Scrapy / aiohttp / requests; Parsers using BeautifulSoup / lxml</w:t>
+        <w:t xml:space="preserve"> </w:t>
+      </w:r>
+      <w:r>
+        <w:t>requests, pathlib, datetime, time, re, sys, urllib.robotparser</w:t>
       </w:r>
     </w:p>
     <w:p>
@@ -1565,28 +1703,7 @@
         <w:rPr>
           <w:rStyle w:val="VerbatimChar"/>
         </w:rPr>
-        <w:t>POST /jobs</w:t>
-      </w:r>
-      <w:r>
-        <w:t xml:space="preserve"> (create crawl job), </w:t>
-      </w:r>
-      <w:r>
-        <w:rPr>
-          <w:rStyle w:val="VerbatimChar"/>
-        </w:rPr>
-        <w:t>GET /jobs/:id/status</w:t>
-      </w:r>
-      <w:r>
-        <w:t xml:space="preserve">, </w:t>
-      </w:r>
-      <w:r>
-        <w:rPr>
-          <w:rStyle w:val="VerbatimChar"/>
-        </w:rPr>
-        <w:t>GET /data/:job</w:t>
-      </w:r>
-      <w:r>
-        <w:t xml:space="preserve"> (auth required)</w:t>
+        <w:t>N/A</w:t>
       </w:r>
     </w:p>
     <w:p>
@@ -1605,7 +1722,10 @@
         <w:t>File handling:</w:t>
       </w:r>
       <w:r>
-        <w:t xml:space="preserve"> storing raw HTML blobs and derived artifacts (images, PDFs)</w:t>
+        <w:t xml:space="preserve"> </w:t>
+      </w:r>
+      <w:r>
+        <w:t>Raw HTML and XML blobs are saved as ASCII files with the appropriate exention.</w:t>
       </w:r>
     </w:p>
     <w:p>
@@ -1624,7 +1744,10 @@
         <w:t>Third-party integrations:</w:t>
       </w:r>
       <w:r>
-        <w:t xml:space="preserve"> CAPTCHA solving (if used), proxy services, cloud storage SDKs</w:t>
+        <w:t xml:space="preserve"> </w:t>
+      </w:r>
+      <w:r>
+        <w:t>N/A</w:t>
       </w:r>
     </w:p>
     <w:p>
@@ -1653,7 +1776,10 @@
         <w:t>Roles &amp; privileges:</w:t>
       </w:r>
       <w:r>
-        <w:t xml:space="preserve"> Developer, Ops, Analyst, Admin</w:t>
+        <w:t xml:space="preserve"> </w:t>
+      </w:r>
+      <w:r>
+        <w:t>End User</w:t>
       </w:r>
     </w:p>
     <w:p>
@@ -1672,7 +1798,10 @@
         <w:t>Interfaces that accept input:</w:t>
       </w:r>
       <w:r>
-        <w:t xml:space="preserve"> seed URL lists, CSS/XPath extraction rules, upload of config files via Admin UI</w:t>
+        <w:t xml:space="preserve"> </w:t>
+      </w:r>
+      <w:r>
+        <w:t>User input for robots.txt target and search term.</w:t>
       </w:r>
     </w:p>
     <w:p>
@@ -1691,7 +1820,10 @@
         <w:t>Authentication:</w:t>
       </w:r>
       <w:r>
-        <w:t xml:space="preserve"> OAuth2 / API tokens for Admin UI and API</w:t>
+        <w:t xml:space="preserve"> </w:t>
+      </w:r>
+      <w:r>
+        <w:t>N/A</w:t>
       </w:r>
     </w:p>
     <w:p>
@@ -1710,7 +1842,10 @@
         <w:t>Human errors:</w:t>
       </w:r>
       <w:r>
-        <w:t xml:space="preserve"> misconfigured seed lists or over-broad crawling causing legal/ethical issues</w:t>
+        <w:t xml:space="preserve"> </w:t>
+      </w:r>
+      <w:r>
+        <w:t>User could run multiple instances of the script and violate the 5 second delay.</w:t>
       </w:r>
     </w:p>
     <w:p>
@@ -1739,7 +1874,20 @@
         <w:t>OS &amp; versions:</w:t>
       </w:r>
       <w:r>
-        <w:t xml:space="preserve"> Ubuntu 22.04 on worker nodes</w:t>
+        <w:rPr>
+          <w:b/>
+          <w:bCs/>
+        </w:rPr>
+        <w:t xml:space="preserve"> </w:t>
+      </w:r>
+      <w:r>
+        <w:t>OS</w:t>
+      </w:r>
+      <w:r>
+        <w:t xml:space="preserve"> </w:t>
+      </w:r>
+      <w:r>
+        <w:t>Agnostic. Should run on any machine with a Python interpreter</w:t>
       </w:r>
     </w:p>
     <w:p>
@@ -1769,10 +1917,10 @@
           <w:b/>
           <w:bCs/>
         </w:rPr>
-        <w:t>:</w:t>
-      </w:r>
-      <w:r>
-        <w:t xml:space="preserve"> Docker Compose for dev; Kubernetes for production (optional)</w:t>
+        <w:t xml:space="preserve">: </w:t>
+      </w:r>
+      <w:r>
+        <w:t>N/A</w:t>
       </w:r>
     </w:p>
     <w:p>
@@ -1791,7 +1939,10 @@
         <w:t>Middleware &amp; runtime:</w:t>
       </w:r>
       <w:r>
-        <w:t xml:space="preserve"> Python 3.11, RabbitMQ, Nginx reverse proxy</w:t>
+        <w:t xml:space="preserve"> </w:t>
+      </w:r>
+      <w:r>
+        <w:t>N/A</w:t>
       </w:r>
     </w:p>
     <w:p>
@@ -1801,7 +1952,6 @@
       <w:bookmarkStart w:id="11" w:name="X8d292ca11434dadaaec348cbe13fb80a8ccb421"/>
       <w:bookmarkEnd w:id="10"/>
       <w:r>
-        <w:lastRenderedPageBreak/>
         <w:t>E. External dependencies (libraries, APIs, frameworks)</w:t>
       </w:r>
     </w:p>
@@ -1821,7 +1971,10 @@
         <w:t>Libraries:</w:t>
       </w:r>
       <w:r>
-        <w:t xml:space="preserve"> Scrapy, Requests/Aiohttp, BeautifulSoup, lxml, SQLAlchemy</w:t>
+        <w:t xml:space="preserve"> </w:t>
+      </w:r>
+      <w:r>
+        <w:t>N/A</w:t>
       </w:r>
     </w:p>
     <w:p>
@@ -1840,16 +1993,20 @@
         <w:t>External services:</w:t>
       </w:r>
       <w:r>
-        <w:t xml:space="preserve"> Proxy provider, CAPTCHA solver, University SSO (for Admin), Cloud storage (AWS S3)</w:t>
+        <w:t xml:space="preserve"> </w:t>
+      </w:r>
+      <w:r>
+        <w:t>N/A</w:t>
       </w:r>
     </w:p>
     <w:p>
       <w:r>
         <w:pict w14:anchorId="158BCC2C">
-          <v:rect id="_x0000_i1099" style="width:0;height:1.5pt" o:hralign="center" o:hrstd="t" o:hr="t"/>
+          <v:rect id="_x0000_i1174" style="width:0;height:1.5pt" o:hralign="center" o:bullet="t" o:hrstd="t" o:hr="t"/>
         </w:pict>
       </w:r>
     </w:p>
+    <w:p/>
     <w:p>
       <w:pPr>
         <w:pStyle w:val="Heading2"/>
@@ -1858,6 +2015,7 @@
       <w:bookmarkEnd w:id="6"/>
       <w:bookmarkEnd w:id="11"/>
       <w:r>
+        <w:lastRenderedPageBreak/>
         <w:t>7. Threats &amp; Attack Vectors (mapping)</w:t>
       </w:r>
     </w:p>
@@ -1957,7 +2115,7 @@
               <w:pStyle w:val="Compact"/>
             </w:pPr>
             <w:r>
-              <w:t>Network / Fetcher</w:t>
+              <w:t>Human</w:t>
             </w:r>
           </w:p>
         </w:tc>
@@ -1970,7 +2128,7 @@
               <w:pStyle w:val="Compact"/>
             </w:pPr>
             <w:r>
-              <w:t>Outbound requests</w:t>
+              <w:t>User Input</w:t>
             </w:r>
           </w:p>
         </w:tc>
@@ -1983,7 +2141,10 @@
               <w:pStyle w:val="Compact"/>
             </w:pPr>
             <w:r>
-              <w:t>Malicious remote servers serving crafted HTML or payloads (e.g., huge responses, slow loris)</w:t>
+              <w:t xml:space="preserve">Someone could use the script to connect to a page </w:t>
+            </w:r>
+            <w:r>
+              <w:t xml:space="preserve">that could be banned through their admin browser settings. </w:t>
             </w:r>
           </w:p>
         </w:tc>
@@ -1997,7 +2158,7 @@
               <w:jc w:val="right"/>
             </w:pPr>
             <w:r>
-              <w:t>Resource exhaustion, DoS of workers</w:t>
+              <w:t>Violation of sysadmin policy</w:t>
             </w:r>
           </w:p>
         </w:tc>
@@ -2010,8 +2171,304 @@
               <w:pStyle w:val="Compact"/>
             </w:pPr>
             <w:r>
-              <w:t>Medium-</w:t>
-            </w:r>
+              <w:t>Low</w:t>
+            </w:r>
+          </w:p>
+        </w:tc>
+      </w:tr>
+      <w:tr>
+        <w:tc>
+          <w:tcPr>
+            <w:tcW w:w="1795" w:type="dxa"/>
+          </w:tcPr>
+          <w:p>
+            <w:pPr>
+              <w:pStyle w:val="Compact"/>
+            </w:pPr>
+            <w:r>
+              <w:t>Robot.txt parser</w:t>
+            </w:r>
+          </w:p>
+        </w:tc>
+        <w:tc>
+          <w:tcPr>
+            <w:tcW w:w="1795" w:type="dxa"/>
+          </w:tcPr>
+          <w:p>
+            <w:pPr>
+              <w:pStyle w:val="Compact"/>
+            </w:pPr>
+            <w:r>
+              <w:t>Parsing Robots.txt file</w:t>
+            </w:r>
+          </w:p>
+        </w:tc>
+        <w:tc>
+          <w:tcPr>
+            <w:tcW w:w="1796" w:type="dxa"/>
+          </w:tcPr>
+          <w:p>
+            <w:pPr>
+              <w:pStyle w:val="Compact"/>
+            </w:pPr>
+            <w:r>
+              <w:t>A malicious robots.txt could be hosted that is</w:t>
+            </w:r>
+            <w:r>
+              <w:t xml:space="preserve"> intentionally large</w:t>
+            </w:r>
+            <w:r>
+              <w:t xml:space="preserve"> and unable to be parsed. </w:t>
+            </w:r>
+          </w:p>
+        </w:tc>
+        <w:tc>
+          <w:tcPr>
+            <w:tcW w:w="2394" w:type="dxa"/>
+          </w:tcPr>
+          <w:p>
+            <w:pPr>
+              <w:pStyle w:val="Compact"/>
+              <w:jc w:val="center"/>
+            </w:pPr>
+            <w:r>
+              <w:t>Extreme memory usage and wasted CPU cycles</w:t>
+            </w:r>
+          </w:p>
+        </w:tc>
+        <w:tc>
+          <w:tcPr>
+            <w:tcW w:w="1796" w:type="dxa"/>
+          </w:tcPr>
+          <w:p>
+            <w:pPr>
+              <w:pStyle w:val="Compact"/>
+            </w:pPr>
+            <w:r>
+              <w:t>Low</w:t>
+            </w:r>
+          </w:p>
+        </w:tc>
+      </w:tr>
+      <w:tr>
+        <w:tc>
+          <w:tcPr>
+            <w:tcW w:w="1795" w:type="dxa"/>
+          </w:tcPr>
+          <w:p>
+            <w:pPr>
+              <w:pStyle w:val="Compact"/>
+            </w:pPr>
+            <w:r>
+              <w:t>Storage</w:t>
+            </w:r>
+          </w:p>
+        </w:tc>
+        <w:tc>
+          <w:tcPr>
+            <w:tcW w:w="1795" w:type="dxa"/>
+          </w:tcPr>
+          <w:p>
+            <w:pPr>
+              <w:pStyle w:val="Compact"/>
+            </w:pPr>
+            <w:r>
+              <w:t xml:space="preserve">Raw HTML </w:t>
+            </w:r>
+            <w:r>
+              <w:t xml:space="preserve">&amp; XML </w:t>
+            </w:r>
+            <w:r>
+              <w:t>storage</w:t>
+            </w:r>
+          </w:p>
+        </w:tc>
+        <w:tc>
+          <w:tcPr>
+            <w:tcW w:w="1796" w:type="dxa"/>
+          </w:tcPr>
+          <w:p>
+            <w:pPr>
+              <w:pStyle w:val="Compact"/>
+            </w:pPr>
+            <w:r>
+              <w:t xml:space="preserve">Accidental storage of malicious </w:t>
+            </w:r>
+            <w:r>
+              <w:t xml:space="preserve">or protected data. </w:t>
+            </w:r>
+          </w:p>
+        </w:tc>
+        <w:tc>
+          <w:tcPr>
+            <w:tcW w:w="2394" w:type="dxa"/>
+          </w:tcPr>
+          <w:p>
+            <w:pPr>
+              <w:pStyle w:val="Compact"/>
+              <w:jc w:val="right"/>
+            </w:pPr>
+            <w:r>
+              <w:t>Data leak, compliance violation</w:t>
+            </w:r>
+            <w:r>
+              <w:t>, security risk</w:t>
+            </w:r>
+          </w:p>
+        </w:tc>
+        <w:tc>
+          <w:tcPr>
+            <w:tcW w:w="1796" w:type="dxa"/>
+          </w:tcPr>
+          <w:p>
+            <w:pPr>
+              <w:pStyle w:val="Compact"/>
+            </w:pPr>
+            <w:r>
+              <w:t>Medium</w:t>
+            </w:r>
+          </w:p>
+        </w:tc>
+      </w:tr>
+      <w:tr>
+        <w:tc>
+          <w:tcPr>
+            <w:tcW w:w="1795" w:type="dxa"/>
+          </w:tcPr>
+          <w:p>
+            <w:pPr>
+              <w:pStyle w:val="Compact"/>
+            </w:pPr>
+            <w:r>
+              <w:t>Environment</w:t>
+            </w:r>
+          </w:p>
+        </w:tc>
+        <w:tc>
+          <w:tcPr>
+            <w:tcW w:w="1795" w:type="dxa"/>
+          </w:tcPr>
+          <w:p>
+            <w:pPr>
+              <w:pStyle w:val="Compact"/>
+            </w:pPr>
+            <w:r>
+              <w:t>Dependencies</w:t>
+            </w:r>
+          </w:p>
+        </w:tc>
+        <w:tc>
+          <w:tcPr>
+            <w:tcW w:w="1796" w:type="dxa"/>
+          </w:tcPr>
+          <w:p>
+            <w:pPr>
+              <w:pStyle w:val="Compact"/>
+            </w:pPr>
+            <w:r>
+              <w:t xml:space="preserve">A vulnerability could exist in </w:t>
+            </w:r>
+            <w:r>
+              <w:t>urllib.robotparser</w:t>
+            </w:r>
+            <w:r>
+              <w:t>.</w:t>
+            </w:r>
+          </w:p>
+        </w:tc>
+        <w:tc>
+          <w:tcPr>
+            <w:tcW w:w="2394" w:type="dxa"/>
+          </w:tcPr>
+          <w:p>
+            <w:pPr>
+              <w:pStyle w:val="Compact"/>
+              <w:jc w:val="right"/>
+            </w:pPr>
+            <w:r>
+              <w:t>Exposure to outside attacks to end-user machines</w:t>
+            </w:r>
+          </w:p>
+        </w:tc>
+        <w:tc>
+          <w:tcPr>
+            <w:tcW w:w="1796" w:type="dxa"/>
+          </w:tcPr>
+          <w:p>
+            <w:pPr>
+              <w:pStyle w:val="Compact"/>
+            </w:pPr>
+            <w:r>
+              <w:t>Low-Medium</w:t>
+            </w:r>
+          </w:p>
+        </w:tc>
+      </w:tr>
+      <w:tr>
+        <w:tc>
+          <w:tcPr>
+            <w:tcW w:w="1795" w:type="dxa"/>
+          </w:tcPr>
+          <w:p>
+            <w:pPr>
+              <w:pStyle w:val="Compact"/>
+            </w:pPr>
+            <w:r>
+              <w:t>Network</w:t>
+            </w:r>
+          </w:p>
+        </w:tc>
+        <w:tc>
+          <w:tcPr>
+            <w:tcW w:w="1795" w:type="dxa"/>
+          </w:tcPr>
+          <w:p>
+            <w:pPr>
+              <w:pStyle w:val="Compact"/>
+            </w:pPr>
+            <w:r>
+              <w:t>IP blocking</w:t>
+            </w:r>
+          </w:p>
+        </w:tc>
+        <w:tc>
+          <w:tcPr>
+            <w:tcW w:w="1796" w:type="dxa"/>
+          </w:tcPr>
+          <w:p>
+            <w:pPr>
+              <w:pStyle w:val="Compact"/>
+            </w:pPr>
+            <w:r>
+              <w:t>Target sites block crawler IPs, or CAPTCHA challenges</w:t>
+            </w:r>
+          </w:p>
+        </w:tc>
+        <w:tc>
+          <w:tcPr>
+            <w:tcW w:w="2394" w:type="dxa"/>
+          </w:tcPr>
+          <w:p>
+            <w:pPr>
+              <w:pStyle w:val="Compact"/>
+              <w:jc w:val="right"/>
+            </w:pPr>
+            <w:r>
+              <w:t xml:space="preserve">Blacklisting from </w:t>
+            </w:r>
+            <w:r>
+              <w:t>certain sites.</w:t>
+            </w:r>
+          </w:p>
+        </w:tc>
+        <w:tc>
+          <w:tcPr>
+            <w:tcW w:w="1796" w:type="dxa"/>
+          </w:tcPr>
+          <w:p>
+            <w:pPr>
+              <w:pStyle w:val="Compact"/>
+            </w:pPr>
             <w:r>
               <w:rPr>
                 <w:highlight w:val="yellow"/>
@@ -2021,362 +2478,17 @@
           </w:p>
         </w:tc>
       </w:tr>
-      <w:tr>
-        <w:tc>
-          <w:tcPr>
-            <w:tcW w:w="1795" w:type="dxa"/>
-          </w:tcPr>
-          <w:p>
-            <w:pPr>
-              <w:pStyle w:val="Compact"/>
-            </w:pPr>
-            <w:r>
-              <w:t>Software / Parser</w:t>
-            </w:r>
-          </w:p>
-        </w:tc>
-        <w:tc>
-          <w:tcPr>
-            <w:tcW w:w="1795" w:type="dxa"/>
-          </w:tcPr>
-          <w:p>
-            <w:pPr>
-              <w:pStyle w:val="Compact"/>
-            </w:pPr>
-            <w:r>
-              <w:t>HTML parsing libraries</w:t>
-            </w:r>
-          </w:p>
-        </w:tc>
-        <w:tc>
-          <w:tcPr>
-            <w:tcW w:w="1796" w:type="dxa"/>
-          </w:tcPr>
-          <w:p>
-            <w:pPr>
-              <w:pStyle w:val="Compact"/>
-            </w:pPr>
-            <w:r>
-              <w:t>Crafted HTML triggering parser vulnerabilities or causing regex ReDoS</w:t>
-            </w:r>
-          </w:p>
-        </w:tc>
-        <w:tc>
-          <w:tcPr>
-            <w:tcW w:w="2394" w:type="dxa"/>
-          </w:tcPr>
-          <w:p>
-            <w:pPr>
-              <w:pStyle w:val="Compact"/>
-              <w:jc w:val="right"/>
-            </w:pPr>
-            <w:r>
-              <w:t>Worker crash or high CPU</w:t>
-            </w:r>
-          </w:p>
-        </w:tc>
-        <w:tc>
-          <w:tcPr>
-            <w:tcW w:w="1796" w:type="dxa"/>
-          </w:tcPr>
-          <w:p>
-            <w:pPr>
-              <w:pStyle w:val="Compact"/>
-            </w:pPr>
-            <w:r>
-              <w:t>Medium</w:t>
-            </w:r>
-          </w:p>
-        </w:tc>
-      </w:tr>
-      <w:tr>
-        <w:tc>
-          <w:tcPr>
-            <w:tcW w:w="1795" w:type="dxa"/>
-          </w:tcPr>
-          <w:p>
-            <w:pPr>
-              <w:pStyle w:val="Compact"/>
-            </w:pPr>
-            <w:r>
-              <w:t>Storage</w:t>
-            </w:r>
-          </w:p>
-        </w:tc>
-        <w:tc>
-          <w:tcPr>
-            <w:tcW w:w="1795" w:type="dxa"/>
-          </w:tcPr>
-          <w:p>
-            <w:pPr>
-              <w:pStyle w:val="Compact"/>
-            </w:pPr>
-            <w:r>
-              <w:t>Raw HTML storage</w:t>
-            </w:r>
-          </w:p>
-        </w:tc>
-        <w:tc>
-          <w:tcPr>
-            <w:tcW w:w="1796" w:type="dxa"/>
-          </w:tcPr>
-          <w:p>
-            <w:pPr>
-              <w:pStyle w:val="Compact"/>
-            </w:pPr>
-            <w:r>
-              <w:t>Accidental storage of sensitive PII scraped from target sites</w:t>
-            </w:r>
-          </w:p>
-        </w:tc>
-        <w:tc>
-          <w:tcPr>
-            <w:tcW w:w="2394" w:type="dxa"/>
-          </w:tcPr>
-          <w:p>
-            <w:pPr>
-              <w:pStyle w:val="Compact"/>
-              <w:jc w:val="right"/>
-            </w:pPr>
-            <w:r>
-              <w:t>Data leak, compliance violation</w:t>
-            </w:r>
-          </w:p>
-        </w:tc>
-        <w:tc>
-          <w:tcPr>
-            <w:tcW w:w="1796" w:type="dxa"/>
-          </w:tcPr>
-          <w:p>
-            <w:pPr>
-              <w:pStyle w:val="Compact"/>
-            </w:pPr>
-            <w:r>
-              <w:t>Medium</w:t>
-            </w:r>
-          </w:p>
-        </w:tc>
-      </w:tr>
-      <w:tr>
-        <w:tc>
-          <w:tcPr>
-            <w:tcW w:w="1795" w:type="dxa"/>
-          </w:tcPr>
-          <w:p>
-            <w:pPr>
-              <w:pStyle w:val="Compact"/>
-            </w:pPr>
-            <w:r>
-              <w:t>Human</w:t>
-            </w:r>
-          </w:p>
-        </w:tc>
-        <w:tc>
-          <w:tcPr>
-            <w:tcW w:w="1795" w:type="dxa"/>
-          </w:tcPr>
-          <w:p>
-            <w:pPr>
-              <w:pStyle w:val="Compact"/>
-            </w:pPr>
-            <w:r>
-              <w:t>Admin UI</w:t>
-            </w:r>
-          </w:p>
-        </w:tc>
-        <w:tc>
-          <w:tcPr>
-            <w:tcW w:w="1796" w:type="dxa"/>
-          </w:tcPr>
-          <w:p>
-            <w:pPr>
-              <w:pStyle w:val="Compact"/>
-            </w:pPr>
-            <w:r>
-              <w:t>Misconfigured seeds or stolen API token</w:t>
-            </w:r>
-          </w:p>
-        </w:tc>
-        <w:tc>
-          <w:tcPr>
-            <w:tcW w:w="2394" w:type="dxa"/>
-          </w:tcPr>
-          <w:p>
-            <w:pPr>
-              <w:pStyle w:val="Compact"/>
-              <w:jc w:val="right"/>
-            </w:pPr>
-            <w:r>
-              <w:t>Unauthorized large-scale crawling or data exfiltration</w:t>
-            </w:r>
-          </w:p>
-        </w:tc>
-        <w:tc>
-          <w:tcPr>
-            <w:tcW w:w="1796" w:type="dxa"/>
-          </w:tcPr>
-          <w:p>
-            <w:pPr>
-              <w:pStyle w:val="Compact"/>
-            </w:pPr>
-            <w:r>
-              <w:rPr>
-                <w:highlight w:val="yellow"/>
-              </w:rPr>
-              <w:t>High</w:t>
-            </w:r>
-          </w:p>
-        </w:tc>
-      </w:tr>
-      <w:tr>
-        <w:tc>
-          <w:tcPr>
-            <w:tcW w:w="1795" w:type="dxa"/>
-          </w:tcPr>
-          <w:p>
-            <w:pPr>
-              <w:pStyle w:val="Compact"/>
-            </w:pPr>
-            <w:r>
-              <w:t>Environment</w:t>
-            </w:r>
-          </w:p>
-        </w:tc>
-        <w:tc>
-          <w:tcPr>
-            <w:tcW w:w="1795" w:type="dxa"/>
-          </w:tcPr>
-          <w:p>
-            <w:pPr>
-              <w:pStyle w:val="Compact"/>
-            </w:pPr>
-            <w:r>
-              <w:t>Dependencies</w:t>
-            </w:r>
-          </w:p>
-        </w:tc>
-        <w:tc>
-          <w:tcPr>
-            <w:tcW w:w="1796" w:type="dxa"/>
-          </w:tcPr>
-          <w:p>
-            <w:pPr>
-              <w:pStyle w:val="Compact"/>
-            </w:pPr>
-            <w:r>
-              <w:t>Vulnerable Python packages (e.g., lxml)</w:t>
-            </w:r>
-          </w:p>
-        </w:tc>
-        <w:tc>
-          <w:tcPr>
-            <w:tcW w:w="2394" w:type="dxa"/>
-          </w:tcPr>
-          <w:p>
-            <w:pPr>
-              <w:pStyle w:val="Compact"/>
-              <w:jc w:val="right"/>
-            </w:pPr>
-            <w:r>
-              <w:t>Remote code execution or supply-chain compromise</w:t>
-            </w:r>
-          </w:p>
-        </w:tc>
-        <w:tc>
-          <w:tcPr>
-            <w:tcW w:w="1796" w:type="dxa"/>
-          </w:tcPr>
-          <w:p>
-            <w:pPr>
-              <w:pStyle w:val="Compact"/>
-            </w:pPr>
-            <w:r>
-              <w:t>Low-Medium</w:t>
-            </w:r>
-          </w:p>
-        </w:tc>
-      </w:tr>
-      <w:tr>
-        <w:tc>
-          <w:tcPr>
-            <w:tcW w:w="1795" w:type="dxa"/>
-          </w:tcPr>
-          <w:p>
-            <w:pPr>
-              <w:pStyle w:val="Compact"/>
-            </w:pPr>
-            <w:r>
-              <w:t>Network</w:t>
-            </w:r>
-          </w:p>
-        </w:tc>
-        <w:tc>
-          <w:tcPr>
-            <w:tcW w:w="1795" w:type="dxa"/>
-          </w:tcPr>
-          <w:p>
-            <w:pPr>
-              <w:pStyle w:val="Compact"/>
-            </w:pPr>
-            <w:r>
-              <w:t>IP blocking</w:t>
-            </w:r>
-          </w:p>
-        </w:tc>
-        <w:tc>
-          <w:tcPr>
-            <w:tcW w:w="1796" w:type="dxa"/>
-          </w:tcPr>
-          <w:p>
-            <w:pPr>
-              <w:pStyle w:val="Compact"/>
-            </w:pPr>
-            <w:r>
-              <w:t>Target sites block crawler IPs, or CAPTCHA challenges</w:t>
-            </w:r>
-          </w:p>
-        </w:tc>
-        <w:tc>
-          <w:tcPr>
-            <w:tcW w:w="2394" w:type="dxa"/>
-          </w:tcPr>
-          <w:p>
-            <w:pPr>
-              <w:pStyle w:val="Compact"/>
-              <w:jc w:val="right"/>
-            </w:pPr>
-            <w:r>
-              <w:t>Loss of data coverage</w:t>
-            </w:r>
-          </w:p>
-        </w:tc>
-        <w:tc>
-          <w:tcPr>
-            <w:tcW w:w="1796" w:type="dxa"/>
-          </w:tcPr>
-          <w:p>
-            <w:pPr>
-              <w:pStyle w:val="Compact"/>
-            </w:pPr>
-            <w:r>
-              <w:rPr>
-                <w:highlight w:val="yellow"/>
-              </w:rPr>
-              <w:t>High</w:t>
-            </w:r>
-          </w:p>
-        </w:tc>
-      </w:tr>
     </w:tbl>
     <w:p>
       <w:bookmarkStart w:id="13" w:name="vulnerability-controls-assessment"/>
       <w:bookmarkEnd w:id="12"/>
       <w:r>
         <w:pict w14:anchorId="158BCC2E">
-          <v:rect id="_x0000_i1100" style="width:0;height:1.5pt" o:hralign="center" o:hrstd="t" o:hr="t"/>
+          <v:rect id="_x0000_i1175" style="width:0;height:1.5pt" o:hralign="center" o:bullet="t" o:hrstd="t" o:hr="t"/>
         </w:pict>
       </w:r>
     </w:p>
+    <w:p/>
     <w:p>
       <w:pPr>
         <w:pStyle w:val="Heading2"/>
@@ -2528,7 +2640,10 @@
               <w:pStyle w:val="Compact"/>
             </w:pPr>
             <w:r>
-              <w:t>Raw HTML store that may contain PII</w:t>
+              <w:t xml:space="preserve">Raw HTML store that may </w:t>
+            </w:r>
+            <w:r>
+              <w:t>malicious or protected data</w:t>
             </w:r>
           </w:p>
         </w:tc>
@@ -2555,7 +2670,83 @@
               <w:jc w:val="right"/>
             </w:pPr>
             <w:r>
-              <w:t>4</w:t>
+              <w:t>2</w:t>
+            </w:r>
+          </w:p>
+        </w:tc>
+        <w:tc>
+          <w:tcPr>
+            <w:tcW w:w="1827" w:type="dxa"/>
+          </w:tcPr>
+          <w:p>
+            <w:pPr>
+              <w:pStyle w:val="Compact"/>
+            </w:pPr>
+            <w:r>
+              <w:t>Low</w:t>
+            </w:r>
+          </w:p>
+        </w:tc>
+      </w:tr>
+      <w:tr>
+        <w:tc>
+          <w:tcPr>
+            <w:tcW w:w="1827" w:type="dxa"/>
+          </w:tcPr>
+          <w:p>
+            <w:pPr>
+              <w:pStyle w:val="Compact"/>
+            </w:pPr>
+            <w:r>
+              <w:t>No vetting of 3</w:t>
+            </w:r>
+            <w:r>
+              <w:rPr>
+                <w:vertAlign w:val="superscript"/>
+              </w:rPr>
+              <w:t>rd</w:t>
+            </w:r>
+            <w:r>
+              <w:t xml:space="preserve"> party library </w:t>
+            </w:r>
+            <w:r>
+              <w:t>uses</w:t>
+            </w:r>
+            <w:r>
+              <w:t xml:space="preserve"> with respect to security</w:t>
+            </w:r>
+          </w:p>
+        </w:tc>
+        <w:tc>
+          <w:tcPr>
+            <w:tcW w:w="1827" w:type="dxa"/>
+          </w:tcPr>
+          <w:p>
+            <w:pPr>
+              <w:pStyle w:val="Compact"/>
+            </w:pPr>
+            <w:r>
+              <w:t xml:space="preserve">Exposes the end-user to possible </w:t>
+            </w:r>
+            <w:r>
+              <w:t>vulnerabilities</w:t>
+            </w:r>
+            <w:r>
+              <w:t xml:space="preserve">. </w:t>
+            </w:r>
+          </w:p>
+        </w:tc>
+        <w:tc>
+          <w:tcPr>
+            <w:tcW w:w="2436" w:type="dxa"/>
+          </w:tcPr>
+          <w:p>
+            <w:pPr>
+              <w:pStyle w:val="Compact"/>
+              <w:jc w:val="right"/>
+            </w:pPr>
+            <w:r>
+              <w:t>5</w:t>
             </w:r>
           </w:p>
         </w:tc>
@@ -2576,69 +2767,11 @@
           </w:p>
         </w:tc>
       </w:tr>
-      <w:tr>
-        <w:tc>
-          <w:tcPr>
-            <w:tcW w:w="1827" w:type="dxa"/>
-          </w:tcPr>
-          <w:p>
-            <w:pPr>
-              <w:pStyle w:val="Compact"/>
-            </w:pPr>
-            <w:r>
-              <w:t>Admin API with job control</w:t>
-            </w:r>
-          </w:p>
-        </w:tc>
-        <w:tc>
-          <w:tcPr>
-            <w:tcW w:w="1827" w:type="dxa"/>
-          </w:tcPr>
-          <w:p>
-            <w:pPr>
-              <w:pStyle w:val="Compact"/>
-            </w:pPr>
-            <w:r>
-              <w:t>Can trigger large crawls or change config</w:t>
-            </w:r>
-          </w:p>
-        </w:tc>
-        <w:tc>
-          <w:tcPr>
-            <w:tcW w:w="2436" w:type="dxa"/>
-          </w:tcPr>
-          <w:p>
-            <w:pPr>
-              <w:pStyle w:val="Compact"/>
-              <w:jc w:val="right"/>
-            </w:pPr>
-            <w:r>
-              <w:t>4</w:t>
-            </w:r>
-          </w:p>
-        </w:tc>
-        <w:tc>
-          <w:tcPr>
-            <w:tcW w:w="1827" w:type="dxa"/>
-          </w:tcPr>
-          <w:p>
-            <w:pPr>
-              <w:pStyle w:val="Compact"/>
-            </w:pPr>
-            <w:r>
-              <w:rPr>
-                <w:highlight w:val="yellow"/>
-              </w:rPr>
-              <w:t>High</w:t>
-            </w:r>
-          </w:p>
-        </w:tc>
-      </w:tr>
     </w:tbl>
     <w:p>
       <w:r>
         <w:pict w14:anchorId="158BCC2F">
-          <v:rect id="_x0000_i1101" style="width:0;height:1.5pt" o:hralign="center" o:hrstd="t" o:hr="t"/>
+          <v:rect id="_x0000_i1171" style="width:0;height:1.5pt" o:hralign="center" o:hrstd="t" o:hr="t"/>
         </w:pict>
       </w:r>
     </w:p>
@@ -2654,16 +2787,88 @@
     </w:p>
     <w:p>
       <w:pPr>
-        <w:pStyle w:val="FirstParagraph"/>
-      </w:pPr>
-      <w:r>
-        <w:t>Design crawlers assuming the remote host may be hostile. Prioritize isolation, strict resource limits, and automated detection of sensitive data. Future work: integrate a legal/ethics review step and automated robots.txt compliance enforcement module.</w:t>
+        <w:pStyle w:val="BodyText"/>
+      </w:pPr>
+      <w:r>
+        <w:t xml:space="preserve">Parsing the robot.txt file from scratch is much more involved than originally anticipated. It also became </w:t>
+      </w:r>
+      <w:r>
+        <w:t xml:space="preserve">obvious early on that many, if not most, are </w:t>
+      </w:r>
+      <w:r>
+        <w:rPr>
+          <w:b/>
+          <w:bCs/>
+        </w:rPr>
+        <w:t>very</w:t>
+      </w:r>
+      <w:r>
+        <w:t xml:space="preserve"> restrictive when it comes to </w:t>
+      </w:r>
+      <w:r>
+        <w:t xml:space="preserve">testing a webcrawler. </w:t>
+      </w:r>
+    </w:p>
+    <w:p>
+      <w:pPr>
+        <w:pStyle w:val="BodyText"/>
+      </w:pPr>
+      <w:r>
+        <w:t>Future work would involve:</w:t>
+      </w:r>
+    </w:p>
+    <w:p>
+      <w:pPr>
+        <w:pStyle w:val="BodyText"/>
+        <w:numPr>
+          <w:ilvl w:val="0"/>
+          <w:numId w:val="23"/>
+        </w:numPr>
+      </w:pPr>
+      <w:r>
+        <w:t>Better error handling</w:t>
+      </w:r>
+    </w:p>
+    <w:p>
+      <w:pPr>
+        <w:pStyle w:val="BodyText"/>
+        <w:numPr>
+          <w:ilvl w:val="0"/>
+          <w:numId w:val="23"/>
+        </w:numPr>
+      </w:pPr>
+      <w:r>
+        <w:t>GUI</w:t>
+      </w:r>
+    </w:p>
+    <w:p>
+      <w:pPr>
+        <w:pStyle w:val="BodyText"/>
+        <w:numPr>
+          <w:ilvl w:val="0"/>
+          <w:numId w:val="23"/>
+        </w:numPr>
+      </w:pPr>
+      <w:r>
+        <w:t>Customizable pathing for storing crawled data</w:t>
+      </w:r>
+    </w:p>
+    <w:p>
+      <w:pPr>
+        <w:pStyle w:val="BodyText"/>
+        <w:numPr>
+          <w:ilvl w:val="0"/>
+          <w:numId w:val="23"/>
+        </w:numPr>
+      </w:pPr>
+      <w:r>
+        <w:t xml:space="preserve">MYSQL Database integration </w:t>
       </w:r>
     </w:p>
     <w:p>
       <w:r>
         <w:pict w14:anchorId="158BCC34">
-          <v:rect id="_x0000_i1102" style="width:0;height:1.5pt" o:hralign="center" o:hrstd="t" o:hr="t"/>
+          <v:rect id="_x0000_i1172" style="width:0;height:1.5pt" o:hralign="center" o:hrstd="t" o:hr="t"/>
         </w:pict>
       </w:r>
     </w:p>
@@ -2686,13 +2891,28 @@
         </w:numPr>
       </w:pPr>
       <w:r>
-        <w:t>v1.0 — 2025-11-13 — Converted example to WebHarvester (crawler) project</w:t>
+        <w:t>v1.0 — 202</w:t>
+      </w:r>
+      <w:r>
+        <w:t>6 4/26/26</w:t>
+      </w:r>
+      <w:r>
+        <w:t xml:space="preserve"> — Converted example to </w:t>
+      </w:r>
+      <w:r>
+        <w:t>PageHarvester</w:t>
+      </w:r>
+      <w:r>
+        <w:t xml:space="preserve"> </w:t>
+      </w:r>
+      <w:r>
+        <w:t>(crawler) project</w:t>
       </w:r>
     </w:p>
     <w:p>
       <w:r>
         <w:pict w14:anchorId="158BCC35">
-          <v:rect id="_x0000_i1103" style="width:0;height:1.5pt" o:hralign="center" o:hrstd="t" o:hr="t"/>
+          <v:rect id="_x0000_i1173" style="width:0;height:1.5pt" o:hralign="center" o:hrstd="t" o:hr="t"/>
         </w:pict>
       </w:r>
     </w:p>
@@ -2768,6 +2988,16 @@
       <v:rect id="_x0000_i1025" style="width:0;height:1.5pt" o:hralign="center" o:bullet="t" o:hrstd="t" o:hr="t"/>
     </w:pict>
   </w:numPicBullet>
+  <w:numPicBullet w:numPicBulletId="1">
+    <w:pict>
+      <v:rect id="_x0000_i1026" style="width:0;height:1.5pt" o:hralign="center" o:bullet="t" o:hrstd="t" o:hr="t"/>
+    </w:pict>
+  </w:numPicBullet>
+  <w:numPicBullet w:numPicBulletId="2">
+    <w:pict>
+      <v:rect id="_x0000_i1027" style="width:0;height:1.5pt" o:hralign="center" o:bullet="t" o:hrstd="t" o:hr="t"/>
+    </w:pict>
+  </w:numPicBullet>
   <w:abstractNum w:abstractNumId="0" w15:restartNumberingAfterBreak="0">
     <w:nsid w:val="0000A990"/>
     <w:multiLevelType w:val="multilevel"/>
@@ -3116,6 +3346,119 @@
     <w:nsid w:val="44B22A40"/>
     <w:multiLevelType w:val="hybridMultilevel"/>
     <w:tmpl w:val="27CE85A8"/>
+    <w:lvl w:ilvl="0" w:tplc="04090001">
+      <w:start w:val="1"/>
+      <w:numFmt w:val="bullet"/>
+      <w:lvlText w:val=""/>
+      <w:lvlJc w:val="left"/>
+      <w:pPr>
+        <w:ind w:left="720" w:hanging="360"/>
+      </w:pPr>
+      <w:rPr>
+        <w:rFonts w:ascii="Symbol" w:hAnsi="Symbol" w:hint="default"/>
+      </w:rPr>
+    </w:lvl>
+    <w:lvl w:ilvl="1" w:tplc="04090003" w:tentative="1">
+      <w:start w:val="1"/>
+      <w:numFmt w:val="bullet"/>
+      <w:lvlText w:val="o"/>
+      <w:lvlJc w:val="left"/>
+      <w:pPr>
+        <w:ind w:left="1440" w:hanging="360"/>
+      </w:pPr>
+      <w:rPr>
+        <w:rFonts w:ascii="Courier New" w:hAnsi="Courier New" w:cs="Courier New" w:hint="default"/>
+      </w:rPr>
+    </w:lvl>
+    <w:lvl w:ilvl="2" w:tplc="04090005" w:tentative="1">
+      <w:start w:val="1"/>
+      <w:numFmt w:val="bullet"/>
+      <w:lvlText w:val=""/>
+      <w:lvlJc w:val="left"/>
+      <w:pPr>
+        <w:ind w:left="2160" w:hanging="360"/>
+      </w:pPr>
+      <w:rPr>
+        <w:rFonts w:ascii="Wingdings" w:hAnsi="Wingdings" w:hint="default"/>
+      </w:rPr>
+    </w:lvl>
+    <w:lvl w:ilvl="3" w:tplc="04090001" w:tentative="1">
+      <w:start w:val="1"/>
+      <w:numFmt w:val="bullet"/>
+      <w:lvlText w:val=""/>
+      <w:lvlJc w:val="left"/>
+      <w:pPr>
+        <w:ind w:left="2880" w:hanging="360"/>
+      </w:pPr>
+      <w:rPr>
+        <w:rFonts w:ascii="Symbol" w:hAnsi="Symbol" w:hint="default"/>
+      </w:rPr>
+    </w:lvl>
+    <w:lvl w:ilvl="4" w:tplc="04090003" w:tentative="1">
+      <w:start w:val="1"/>
+      <w:numFmt w:val="bullet"/>
+      <w:lvlText w:val="o"/>
+      <w:lvlJc w:val="left"/>
+      <w:pPr>
+        <w:ind w:left="3600" w:hanging="360"/>
+      </w:pPr>
+      <w:rPr>
+        <w:rFonts w:ascii="Courier New" w:hAnsi="Courier New" w:cs="Courier New" w:hint="default"/>
+      </w:rPr>
+    </w:lvl>
+    <w:lvl w:ilvl="5" w:tplc="04090005" w:tentative="1">
+      <w:start w:val="1"/>
+      <w:numFmt w:val="bullet"/>
+      <w:lvlText w:val=""/>
+      <w:lvlJc w:val="left"/>
+      <w:pPr>
+        <w:ind w:left="4320" w:hanging="360"/>
+      </w:pPr>
+      <w:rPr>
+        <w:rFonts w:ascii="Wingdings" w:hAnsi="Wingdings" w:hint="default"/>
+      </w:rPr>
+    </w:lvl>
+    <w:lvl w:ilvl="6" w:tplc="04090001" w:tentative="1">
+      <w:start w:val="1"/>
+      <w:numFmt w:val="bullet"/>
+      <w:lvlText w:val=""/>
+      <w:lvlJc w:val="left"/>
+      <w:pPr>
+        <w:ind w:left="5040" w:hanging="360"/>
+      </w:pPr>
+      <w:rPr>
+        <w:rFonts w:ascii="Symbol" w:hAnsi="Symbol" w:hint="default"/>
+      </w:rPr>
+    </w:lvl>
+    <w:lvl w:ilvl="7" w:tplc="04090003" w:tentative="1">
+      <w:start w:val="1"/>
+      <w:numFmt w:val="bullet"/>
+      <w:lvlText w:val="o"/>
+      <w:lvlJc w:val="left"/>
+      <w:pPr>
+        <w:ind w:left="5760" w:hanging="360"/>
+      </w:pPr>
+      <w:rPr>
+        <w:rFonts w:ascii="Courier New" w:hAnsi="Courier New" w:cs="Courier New" w:hint="default"/>
+      </w:rPr>
+    </w:lvl>
+    <w:lvl w:ilvl="8" w:tplc="04090005" w:tentative="1">
+      <w:start w:val="1"/>
+      <w:numFmt w:val="bullet"/>
+      <w:lvlText w:val=""/>
+      <w:lvlJc w:val="left"/>
+      <w:pPr>
+        <w:ind w:left="6480" w:hanging="360"/>
+      </w:pPr>
+      <w:rPr>
+        <w:rFonts w:ascii="Wingdings" w:hAnsi="Wingdings" w:hint="default"/>
+      </w:rPr>
+    </w:lvl>
+  </w:abstractNum>
+  <w:abstractNum w:abstractNumId="5" w15:restartNumberingAfterBreak="0">
+    <w:nsid w:val="7BCC23EE"/>
+    <w:multiLevelType w:val="hybridMultilevel"/>
+    <w:tmpl w:val="2FAA1328"/>
     <w:lvl w:ilvl="0" w:tplc="04090001">
       <w:start w:val="1"/>
       <w:numFmt w:val="bullet"/>
@@ -3344,6 +3687,9 @@
   </w:num>
   <w:num w:numId="22" w16cid:durableId="850951051">
     <w:abstractNumId w:val="4"/>
+  </w:num>
+  <w:num w:numId="23" w16cid:durableId="1425955428">
+    <w:abstractNumId w:val="5"/>
   </w:num>
 </w:numbering>
 </file>

</xml_diff>